<commit_message>
Added final report pdf
</commit_message>
<xml_diff>
--- a/Docs/Final Project Report.docx
+++ b/Docs/Final Project Report.docx
@@ -451,125 +451,55 @@
     <w:p>
       <w:pPr>
         <w:rPr>
-          <w:rFonts w:cstheme="minorHAnsi"/>
-          <w:sz w:val="40"/>
-          <w:szCs w:val="40"/>
-        </w:rPr>
-      </w:pPr>
-      <w:r>
-        <w:rPr>
-          <w:rFonts w:cstheme="minorHAnsi"/>
-          <w:sz w:val="40"/>
-          <w:szCs w:val="40"/>
-        </w:rPr>
-        <w:t>Natural disasters can disrupt cellular networks, internet connectivity and electrical power when communication methods are most</w:t>
-      </w:r>
-      <w:r>
-        <w:rPr>
-          <w:rFonts w:cstheme="minorHAnsi"/>
-          <w:sz w:val="40"/>
-          <w:szCs w:val="40"/>
-        </w:rPr>
-        <w:t>ly</w:t>
-      </w:r>
-      <w:r>
-        <w:rPr>
-          <w:rFonts w:cstheme="minorHAnsi"/>
-          <w:sz w:val="40"/>
-          <w:szCs w:val="40"/>
-        </w:rPr>
-        <w:t xml:space="preserve"> needed. </w:t>
-      </w:r>
-    </w:p>
-    <w:p>
-      <w:pPr>
-        <w:jc w:val="right"/>
-        <w:rPr>
           <w:rFonts w:asciiTheme="majorHAnsi" w:hAnsiTheme="majorHAnsi" w:cstheme="majorHAnsi"/>
           <w:sz w:val="52"/>
           <w:szCs w:val="52"/>
         </w:rPr>
       </w:pPr>
-    </w:p>
-    <w:p>
-      <w:pPr>
-        <w:jc w:val="right"/>
-        <w:rPr>
-          <w:rFonts w:asciiTheme="majorHAnsi" w:hAnsiTheme="majorHAnsi" w:cstheme="majorHAnsi"/>
-          <w:sz w:val="52"/>
-          <w:szCs w:val="52"/>
-        </w:rPr>
-      </w:pPr>
-    </w:p>
-    <w:p>
-      <w:pPr>
-        <w:jc w:val="right"/>
-        <w:rPr>
-          <w:rFonts w:asciiTheme="majorHAnsi" w:hAnsiTheme="majorHAnsi" w:cstheme="majorHAnsi"/>
-          <w:sz w:val="52"/>
-          <w:szCs w:val="52"/>
-        </w:rPr>
-      </w:pPr>
-    </w:p>
-    <w:p>
-      <w:pPr>
-        <w:jc w:val="right"/>
-        <w:rPr>
-          <w:rFonts w:asciiTheme="majorHAnsi" w:hAnsiTheme="majorHAnsi" w:cstheme="majorHAnsi"/>
-          <w:sz w:val="52"/>
-          <w:szCs w:val="52"/>
-        </w:rPr>
-      </w:pPr>
-    </w:p>
-    <w:p>
-      <w:pPr>
-        <w:jc w:val="right"/>
-        <w:rPr>
-          <w:rFonts w:asciiTheme="majorHAnsi" w:hAnsiTheme="majorHAnsi" w:cstheme="majorHAnsi"/>
-          <w:sz w:val="52"/>
-          <w:szCs w:val="52"/>
-        </w:rPr>
-      </w:pPr>
-    </w:p>
-    <w:p>
-      <w:pPr>
-        <w:jc w:val="right"/>
-        <w:rPr>
-          <w:rFonts w:asciiTheme="majorHAnsi" w:hAnsiTheme="majorHAnsi" w:cstheme="majorHAnsi"/>
-          <w:sz w:val="52"/>
-          <w:szCs w:val="52"/>
-        </w:rPr>
-      </w:pPr>
-    </w:p>
-    <w:p>
-      <w:pPr>
-        <w:jc w:val="right"/>
-        <w:rPr>
-          <w:rFonts w:asciiTheme="majorHAnsi" w:hAnsiTheme="majorHAnsi" w:cstheme="majorHAnsi"/>
-          <w:sz w:val="52"/>
-          <w:szCs w:val="52"/>
-        </w:rPr>
-      </w:pPr>
-    </w:p>
-    <w:p>
-      <w:pPr>
-        <w:jc w:val="right"/>
-        <w:rPr>
-          <w:rFonts w:asciiTheme="majorHAnsi" w:hAnsiTheme="majorHAnsi" w:cstheme="majorHAnsi"/>
-          <w:sz w:val="52"/>
-          <w:szCs w:val="52"/>
-        </w:rPr>
-      </w:pPr>
-    </w:p>
-    <w:p>
-      <w:pPr>
-        <w:jc w:val="right"/>
-        <w:rPr>
-          <w:rFonts w:asciiTheme="majorHAnsi" w:hAnsiTheme="majorHAnsi" w:cstheme="majorHAnsi"/>
-          <w:sz w:val="52"/>
-          <w:szCs w:val="52"/>
-        </w:rPr>
-      </w:pPr>
+      <w:r>
+        <w:rPr>
+          <w:rFonts w:cstheme="minorHAnsi"/>
+          <w:sz w:val="40"/>
+          <w:szCs w:val="40"/>
+        </w:rPr>
+        <w:t xml:space="preserve">Natural disasters can disrupt cellular networks, internet connectivity, and electrical power at the very time when communication is essential resulting in delayed responses and rescue teams not being able to find the individuals that need to be rescued. </w:t>
+      </w:r>
+      <w:proofErr w:type="spellStart"/>
+      <w:r>
+        <w:rPr>
+          <w:rFonts w:cstheme="minorHAnsi"/>
+          <w:sz w:val="40"/>
+          <w:szCs w:val="40"/>
+        </w:rPr>
+        <w:t>LifeLine</w:t>
+      </w:r>
+      <w:proofErr w:type="spellEnd"/>
+      <w:r>
+        <w:rPr>
+          <w:rFonts w:cstheme="minorHAnsi"/>
+          <w:sz w:val="40"/>
+          <w:szCs w:val="40"/>
+        </w:rPr>
+        <w:t xml:space="preserve"> seeks to solve this problem by offering a robust low power emergency communication channel through the use of LoRa (Long Range) technology. </w:t>
+      </w:r>
+      <w:proofErr w:type="spellStart"/>
+      <w:r>
+        <w:rPr>
+          <w:rFonts w:cstheme="minorHAnsi"/>
+          <w:sz w:val="40"/>
+          <w:szCs w:val="40"/>
+        </w:rPr>
+        <w:t>LifeLine</w:t>
+      </w:r>
+      <w:proofErr w:type="spellEnd"/>
+      <w:r>
+        <w:rPr>
+          <w:rFonts w:cstheme="minorHAnsi"/>
+          <w:sz w:val="40"/>
+          <w:szCs w:val="40"/>
+        </w:rPr>
+        <w:t xml:space="preserve"> uses LoRa technology, GPS, and Raspberry Pi to transmit emergency messages as well as location information in cases where communication systems are down. The messages received are then parsed and shown on a map interface to enable rescue teams to find and track the individuals in need. Our ultimate goal is to help rescue teams quickly understand the situation, coordinate their efforts, and respond more effectively to disasters.</w:t>
+      </w:r>
     </w:p>
     <w:p>
       <w:pPr>
@@ -852,23 +782,13 @@
         </w:rPr>
         <w:t xml:space="preserve"> </w:t>
       </w:r>
-      <w:proofErr w:type="gramStart"/>
       <w:r>
         <w:rPr>
           <w:rFonts w:cstheme="minorHAnsi"/>
           <w:sz w:val="36"/>
           <w:szCs w:val="36"/>
         </w:rPr>
-        <w:t>prevents</w:t>
-      </w:r>
-      <w:proofErr w:type="gramEnd"/>
-      <w:r>
-        <w:rPr>
-          <w:rFonts w:cstheme="minorHAnsi"/>
-          <w:sz w:val="36"/>
-          <w:szCs w:val="36"/>
-        </w:rPr>
-        <w:t xml:space="preserve"> loops</w:t>
+        <w:t>prevent loops</w:t>
       </w:r>
       <w:r>
         <w:rPr>
@@ -994,36 +914,52 @@
           <w:sz w:val="36"/>
           <w:szCs w:val="36"/>
         </w:rPr>
-        <w:t>Requirements</w:t>
-      </w:r>
-      <w:r>
+        <w:t>Conclusion and Future work</w:t>
+      </w:r>
+    </w:p>
+    <w:p>
+      <w:pPr>
+        <w:pStyle w:val="ListParagraph"/>
+        <w:numPr>
+          <w:ilvl w:val="0"/>
+          <w:numId w:val="1"/>
+        </w:numPr>
         <w:rPr>
           <w:rFonts w:cstheme="minorHAnsi"/>
           <w:sz w:val="36"/>
           <w:szCs w:val="36"/>
         </w:rPr>
-        <w:t xml:space="preserve"> analysis and System Design</w:t>
-      </w:r>
-    </w:p>
-    <w:p>
-      <w:pPr>
-        <w:jc w:val="right"/>
-        <w:rPr>
-          <w:rFonts w:asciiTheme="majorHAnsi" w:hAnsiTheme="majorHAnsi" w:cstheme="majorHAnsi"/>
-          <w:sz w:val="52"/>
-          <w:szCs w:val="52"/>
-        </w:rPr>
-      </w:pPr>
-    </w:p>
-    <w:p>
-      <w:pPr>
-        <w:jc w:val="right"/>
-        <w:rPr>
-          <w:rFonts w:asciiTheme="majorHAnsi" w:hAnsiTheme="majorHAnsi" w:cstheme="majorHAnsi"/>
-          <w:sz w:val="52"/>
-          <w:szCs w:val="52"/>
-        </w:rPr>
-      </w:pPr>
+      </w:pPr>
+      <w:r>
+        <w:rPr>
+          <w:rFonts w:cstheme="minorHAnsi"/>
+          <w:sz w:val="36"/>
+          <w:szCs w:val="36"/>
+        </w:rPr>
+        <w:t>Deployment readiness and statement</w:t>
+      </w:r>
+    </w:p>
+    <w:p>
+      <w:pPr>
+        <w:pStyle w:val="ListParagraph"/>
+        <w:numPr>
+          <w:ilvl w:val="0"/>
+          <w:numId w:val="1"/>
+        </w:numPr>
+        <w:rPr>
+          <w:rFonts w:cstheme="minorHAnsi"/>
+          <w:sz w:val="36"/>
+          <w:szCs w:val="36"/>
+        </w:rPr>
+      </w:pPr>
+      <w:r>
+        <w:rPr>
+          <w:rFonts w:cstheme="minorHAnsi"/>
+          <w:sz w:val="36"/>
+          <w:szCs w:val="36"/>
+        </w:rPr>
+        <w:t>Appendix</w:t>
+      </w:r>
     </w:p>
     <w:p>
       <w:pPr>
@@ -1108,60 +1044,24 @@
           <w:sz w:val="40"/>
           <w:szCs w:val="40"/>
         </w:rPr>
-        <w:t xml:space="preserve">asters can corrupt the regular communication grid. Sometimes disaster relief stations cannot identify who and where are the survivors, </w:t>
-      </w:r>
-      <w:proofErr w:type="gramStart"/>
-      <w:r>
-        <w:rPr>
-          <w:rFonts w:cstheme="minorHAnsi"/>
-          <w:sz w:val="40"/>
-          <w:szCs w:val="40"/>
-        </w:rPr>
-        <w:t>is</w:t>
-      </w:r>
-      <w:proofErr w:type="gramEnd"/>
-      <w:r>
-        <w:rPr>
-          <w:rFonts w:cstheme="minorHAnsi"/>
-          <w:sz w:val="40"/>
-          <w:szCs w:val="40"/>
-        </w:rPr>
-        <w:t xml:space="preserve"> there any other secondary disaster happened in those disaster isolated areas. </w:t>
-      </w:r>
-    </w:p>
-    <w:p>
-      <w:pPr>
-        <w:rPr>
-          <w:rFonts w:cstheme="minorHAnsi"/>
-          <w:sz w:val="40"/>
-          <w:szCs w:val="40"/>
-        </w:rPr>
-      </w:pPr>
-      <w:r>
-        <w:rPr>
-          <w:rFonts w:cstheme="minorHAnsi"/>
-          <w:sz w:val="40"/>
-          <w:szCs w:val="40"/>
-        </w:rPr>
-        <w:t xml:space="preserve">As an </w:t>
-      </w:r>
-      <w:proofErr w:type="gramStart"/>
-      <w:r>
-        <w:rPr>
-          <w:rFonts w:cstheme="minorHAnsi"/>
-          <w:sz w:val="40"/>
-          <w:szCs w:val="40"/>
-        </w:rPr>
-        <w:t>example</w:t>
-      </w:r>
-      <w:proofErr w:type="gramEnd"/>
-      <w:r>
-        <w:rPr>
-          <w:rFonts w:cstheme="minorHAnsi"/>
-          <w:sz w:val="40"/>
-          <w:szCs w:val="40"/>
-        </w:rPr>
-        <w:t xml:space="preserve"> when Sri Lankan people faced </w:t>
+        <w:t xml:space="preserve">asters can corrupt the regular communication grid. Sometimes disaster relief stations cannot identify who and where are the survivors, is there any other secondary disaster happened in those disaster isolated areas. </w:t>
+      </w:r>
+    </w:p>
+    <w:p>
+      <w:pPr>
+        <w:rPr>
+          <w:rFonts w:cstheme="minorHAnsi"/>
+          <w:sz w:val="40"/>
+          <w:szCs w:val="40"/>
+        </w:rPr>
+      </w:pPr>
+      <w:r>
+        <w:rPr>
+          <w:rFonts w:cstheme="minorHAnsi"/>
+          <w:sz w:val="40"/>
+          <w:szCs w:val="40"/>
+        </w:rPr>
+        <w:t xml:space="preserve">As an example when Sri Lankan people faced </w:t>
       </w:r>
       <w:proofErr w:type="spellStart"/>
       <w:r>
@@ -1185,23 +1085,13 @@
         </w:rPr>
         <w:t xml:space="preserve">, </w:t>
       </w:r>
-      <w:proofErr w:type="gramStart"/>
-      <w:r>
-        <w:rPr>
-          <w:rFonts w:cstheme="minorHAnsi"/>
-          <w:sz w:val="40"/>
-          <w:szCs w:val="40"/>
-        </w:rPr>
-        <w:t>Out</w:t>
-      </w:r>
-      <w:proofErr w:type="gramEnd"/>
-      <w:r>
-        <w:rPr>
-          <w:rFonts w:cstheme="minorHAnsi"/>
-          <w:sz w:val="40"/>
-          <w:szCs w:val="40"/>
-        </w:rPr>
-        <w:t xml:space="preserve"> of roughly 16,000 mobile transmission towers nationwide, </w:t>
+      <w:r>
+        <w:rPr>
+          <w:rFonts w:cstheme="minorHAnsi"/>
+          <w:sz w:val="40"/>
+          <w:szCs w:val="40"/>
+        </w:rPr>
+        <w:t xml:space="preserve">Out of roughly 16,000 mobile transmission towers nationwide, </w:t>
       </w:r>
       <w:r>
         <w:rPr>
@@ -1357,25 +1247,7 @@
           <w:sz w:val="40"/>
           <w:szCs w:val="40"/>
         </w:rPr>
-        <w:t xml:space="preserve">Our solution is </w:t>
-      </w:r>
-      <w:proofErr w:type="gramStart"/>
-      <w:r>
-        <w:rPr>
-          <w:rFonts w:cstheme="minorHAnsi"/>
-          <w:sz w:val="40"/>
-          <w:szCs w:val="40"/>
-        </w:rPr>
-        <w:t>distribute</w:t>
-      </w:r>
-      <w:proofErr w:type="gramEnd"/>
-      <w:r>
-        <w:rPr>
-          <w:rFonts w:cstheme="minorHAnsi"/>
-          <w:sz w:val="40"/>
-          <w:szCs w:val="40"/>
-        </w:rPr>
-        <w:t xml:space="preserve"> a device called </w:t>
+        <w:t xml:space="preserve">Our solution is distribute a device called </w:t>
       </w:r>
       <w:r>
         <w:rPr>
@@ -1393,25 +1265,7 @@
           <w:sz w:val="40"/>
           <w:szCs w:val="40"/>
         </w:rPr>
-        <w:t xml:space="preserve"> around a country and keep them online. When a part of the district </w:t>
-      </w:r>
-      <w:proofErr w:type="gramStart"/>
-      <w:r>
-        <w:rPr>
-          <w:rFonts w:cstheme="minorHAnsi"/>
-          <w:sz w:val="40"/>
-          <w:szCs w:val="40"/>
-        </w:rPr>
-        <w:t>got</w:t>
-      </w:r>
-      <w:proofErr w:type="gramEnd"/>
-      <w:r>
-        <w:rPr>
-          <w:rFonts w:cstheme="minorHAnsi"/>
-          <w:sz w:val="40"/>
-          <w:szCs w:val="40"/>
-        </w:rPr>
-        <w:t xml:space="preserve"> isolated people can connect with the nearest Node with their phone and send SOS message to nearby disaster relief center. Node uses radio mesh network to reach further distances. So that network cannot be isolated easily. </w:t>
+        <w:t xml:space="preserve"> around a country and keep them online. When a part of the district got isolated people can connect with the nearest Node with their phone and send SOS message to nearby disaster relief center. Node uses radio mesh network to reach further distances. So that network cannot be isolated easily. </w:t>
       </w:r>
     </w:p>
     <w:p>
@@ -1511,27 +1365,7 @@
           <w:sz w:val="40"/>
           <w:szCs w:val="40"/>
         </w:rPr>
-        <w:t xml:space="preserve">Creating a </w:t>
-      </w:r>
-      <w:proofErr w:type="gramStart"/>
-      <w:r>
-        <w:rPr>
-          <w:rFonts w:cstheme="minorHAnsi"/>
-          <w:color w:val="000000" w:themeColor="text1"/>
-          <w:sz w:val="40"/>
-          <w:szCs w:val="40"/>
-        </w:rPr>
-        <w:t>user friendly</w:t>
-      </w:r>
-      <w:proofErr w:type="gramEnd"/>
-      <w:r>
-        <w:rPr>
-          <w:rFonts w:cstheme="minorHAnsi"/>
-          <w:color w:val="000000" w:themeColor="text1"/>
-          <w:sz w:val="40"/>
-          <w:szCs w:val="40"/>
-        </w:rPr>
-        <w:t xml:space="preserve"> mobile application and displaying delivery status.</w:t>
+        <w:t>Creating a user friendly mobile application and displaying delivery status.</w:t>
       </w:r>
     </w:p>
     <w:p>
@@ -1555,27 +1389,7 @@
           <w:sz w:val="40"/>
           <w:szCs w:val="40"/>
         </w:rPr>
-        <w:t xml:space="preserve">Developing a mesh network that </w:t>
-      </w:r>
-      <w:proofErr w:type="gramStart"/>
-      <w:r>
-        <w:rPr>
-          <w:rFonts w:cstheme="minorHAnsi"/>
-          <w:color w:val="000000" w:themeColor="text1"/>
-          <w:sz w:val="40"/>
-          <w:szCs w:val="40"/>
-        </w:rPr>
-        <w:t>do</w:t>
-      </w:r>
-      <w:proofErr w:type="gramEnd"/>
-      <w:r>
-        <w:rPr>
-          <w:rFonts w:cstheme="minorHAnsi"/>
-          <w:color w:val="000000" w:themeColor="text1"/>
-          <w:sz w:val="40"/>
-          <w:szCs w:val="40"/>
-        </w:rPr>
-        <w:t xml:space="preserve"> not repeat a successfully sent message.</w:t>
+        <w:t>Developing a mesh network that do not repeat a successfully sent message.</w:t>
       </w:r>
     </w:p>
     <w:p>
@@ -1611,7 +1425,6 @@
           <w:szCs w:val="40"/>
         </w:rPr>
       </w:pPr>
-      <w:proofErr w:type="gramStart"/>
       <w:r>
         <w:rPr>
           <w:rFonts w:asciiTheme="majorHAnsi" w:hAnsiTheme="majorHAnsi" w:cstheme="majorHAnsi"/>
@@ -1620,9 +1433,8 @@
           <w:szCs w:val="40"/>
         </w:rPr>
         <w:lastRenderedPageBreak/>
-        <w:t>Constrains</w:t>
-      </w:r>
-      <w:proofErr w:type="gramEnd"/>
+        <w:t>Constraints</w:t>
+      </w:r>
       <w:r>
         <w:rPr>
           <w:rFonts w:asciiTheme="majorHAnsi" w:hAnsiTheme="majorHAnsi" w:cstheme="majorHAnsi"/>
@@ -1674,25 +1486,7 @@
           <w:sz w:val="40"/>
           <w:szCs w:val="40"/>
         </w:rPr>
-        <w:t xml:space="preserve">Nodes are assumed to be operated by trained </w:t>
-      </w:r>
-      <w:proofErr w:type="gramStart"/>
-      <w:r>
-        <w:rPr>
-          <w:rFonts w:cstheme="minorHAnsi"/>
-          <w:sz w:val="40"/>
-          <w:szCs w:val="40"/>
-        </w:rPr>
-        <w:t>users</w:t>
-      </w:r>
-      <w:proofErr w:type="gramEnd"/>
-      <w:r>
-        <w:rPr>
-          <w:rFonts w:cstheme="minorHAnsi"/>
-          <w:sz w:val="40"/>
-          <w:szCs w:val="40"/>
-        </w:rPr>
-        <w:t xml:space="preserve"> and they do not supply wrong information.</w:t>
+        <w:t>Nodes are assumed to be operated by trained users and they do not supply wrong information.</w:t>
       </w:r>
     </w:p>
     <w:p>
@@ -1904,114 +1698,60 @@
           <w:sz w:val="40"/>
           <w:szCs w:val="40"/>
         </w:rPr>
-        <w:t xml:space="preserve">Cellular networks are vulnerable for majority of disasters. They </w:t>
-      </w:r>
-      <w:proofErr w:type="gramStart"/>
-      <w:r>
-        <w:rPr>
-          <w:rFonts w:cstheme="minorHAnsi"/>
-          <w:sz w:val="40"/>
-          <w:szCs w:val="40"/>
-        </w:rPr>
-        <w:t>could be</w:t>
-      </w:r>
-      <w:proofErr w:type="gramEnd"/>
-      <w:r>
-        <w:rPr>
-          <w:rFonts w:cstheme="minorHAnsi"/>
-          <w:sz w:val="40"/>
-          <w:szCs w:val="40"/>
-        </w:rPr>
-        <w:t xml:space="preserve"> easily </w:t>
-      </w:r>
-      <w:proofErr w:type="gramStart"/>
-      <w:r>
-        <w:rPr>
-          <w:rFonts w:cstheme="minorHAnsi"/>
-          <w:sz w:val="40"/>
-          <w:szCs w:val="40"/>
-        </w:rPr>
-        <w:t>go</w:t>
-      </w:r>
-      <w:proofErr w:type="gramEnd"/>
-      <w:r>
-        <w:rPr>
-          <w:rFonts w:cstheme="minorHAnsi"/>
-          <w:sz w:val="40"/>
-          <w:szCs w:val="40"/>
-        </w:rPr>
-        <w:t xml:space="preserve"> down. Satellite systems require compatible equipment, clear sky view for many services, subscription or airtime arrangements, and additional cost.</w:t>
-      </w:r>
-    </w:p>
-    <w:p>
-      <w:pPr>
-        <w:rPr>
-          <w:rFonts w:cstheme="minorHAnsi"/>
-          <w:sz w:val="40"/>
-          <w:szCs w:val="40"/>
-        </w:rPr>
-      </w:pPr>
-      <w:r>
-        <w:rPr>
-          <w:rFonts w:cstheme="minorHAnsi"/>
-          <w:sz w:val="40"/>
-          <w:szCs w:val="40"/>
-        </w:rPr>
-        <w:t xml:space="preserve">Professional radio systems are robust but </w:t>
-      </w:r>
-      <w:proofErr w:type="gramStart"/>
-      <w:r>
-        <w:rPr>
-          <w:rFonts w:cstheme="minorHAnsi"/>
-          <w:sz w:val="40"/>
-          <w:szCs w:val="40"/>
-        </w:rPr>
-        <w:t>requires</w:t>
-      </w:r>
-      <w:proofErr w:type="gramEnd"/>
-      <w:r>
-        <w:rPr>
-          <w:rFonts w:cstheme="minorHAnsi"/>
-          <w:sz w:val="40"/>
-          <w:szCs w:val="40"/>
-        </w:rPr>
-        <w:t xml:space="preserve"> licensed operators, repeaters and expensive equipment.</w:t>
-      </w:r>
-    </w:p>
-    <w:p>
-      <w:pPr>
-        <w:rPr>
-          <w:rFonts w:cstheme="minorHAnsi"/>
-          <w:sz w:val="40"/>
-          <w:szCs w:val="40"/>
-        </w:rPr>
-      </w:pPr>
-      <w:r>
-        <w:rPr>
-          <w:rFonts w:cstheme="minorHAnsi"/>
-          <w:sz w:val="40"/>
-          <w:szCs w:val="40"/>
-        </w:rPr>
-        <w:t xml:space="preserve">A small radio mesh that controlled with a </w:t>
-      </w:r>
-      <w:proofErr w:type="gramStart"/>
-      <w:r>
-        <w:rPr>
-          <w:rFonts w:cstheme="minorHAnsi"/>
-          <w:sz w:val="40"/>
-          <w:szCs w:val="40"/>
-        </w:rPr>
-        <w:t>user friendly</w:t>
-      </w:r>
-      <w:proofErr w:type="gramEnd"/>
-      <w:r>
-        <w:rPr>
-          <w:rFonts w:cstheme="minorHAnsi"/>
-          <w:sz w:val="40"/>
-          <w:szCs w:val="40"/>
-        </w:rPr>
-        <w:t xml:space="preserve"> application in their phone can be a good solution in this case.</w:t>
-      </w:r>
+        <w:t>Cellular networks are vulnerable for majority of disasters. They could be easily go down. Satellite systems require compatible equipment, clear sky view for many services, subscription or airtime arrangements, and additional cost.</w:t>
+      </w:r>
+    </w:p>
+    <w:p>
+      <w:pPr>
+        <w:rPr>
+          <w:rFonts w:cstheme="minorHAnsi"/>
+          <w:sz w:val="40"/>
+          <w:szCs w:val="40"/>
+        </w:rPr>
+      </w:pPr>
+      <w:r>
+        <w:rPr>
+          <w:rFonts w:cstheme="minorHAnsi"/>
+          <w:sz w:val="40"/>
+          <w:szCs w:val="40"/>
+        </w:rPr>
+        <w:t>Professional radio systems are robust but requires licensed operators, repeaters and expensive equipment.</w:t>
+      </w:r>
+    </w:p>
+    <w:p>
+      <w:pPr>
+        <w:rPr>
+          <w:rFonts w:cstheme="minorHAnsi"/>
+          <w:sz w:val="40"/>
+          <w:szCs w:val="40"/>
+        </w:rPr>
+      </w:pPr>
+      <w:r>
+        <w:rPr>
+          <w:rFonts w:cstheme="minorHAnsi"/>
+          <w:sz w:val="40"/>
+          <w:szCs w:val="40"/>
+        </w:rPr>
+        <w:t>A small radio mesh that controlled with a user friendly application in their phone can be a good solution in this case.</w:t>
+      </w:r>
+    </w:p>
+    <w:p>
+      <w:pPr>
+        <w:rPr>
+          <w:rFonts w:cstheme="minorHAnsi"/>
+          <w:sz w:val="40"/>
+          <w:szCs w:val="40"/>
+        </w:rPr>
+      </w:pPr>
+    </w:p>
+    <w:p>
+      <w:pPr>
+        <w:rPr>
+          <w:rFonts w:cstheme="minorHAnsi"/>
+          <w:sz w:val="40"/>
+          <w:szCs w:val="40"/>
+        </w:rPr>
+      </w:pPr>
     </w:p>
     <w:p>
       <w:pPr>
@@ -2029,6 +1769,7 @@
           <w:sz w:val="40"/>
           <w:szCs w:val="40"/>
         </w:rPr>
+        <w:lastRenderedPageBreak/>
         <w:t>Why LoRa?</w:t>
       </w:r>
     </w:p>
@@ -2046,44 +1787,7 @@
           <w:sz w:val="40"/>
           <w:szCs w:val="40"/>
         </w:rPr>
-        <w:lastRenderedPageBreak/>
-        <w:t xml:space="preserve">LoRa (Long Range) is a technology developed for </w:t>
-      </w:r>
-      <w:proofErr w:type="gramStart"/>
-      <w:r>
-        <w:rPr>
-          <w:rFonts w:cstheme="minorHAnsi"/>
-          <w:sz w:val="40"/>
-          <w:szCs w:val="40"/>
-        </w:rPr>
-        <w:t>send</w:t>
-      </w:r>
-      <w:proofErr w:type="gramEnd"/>
-      <w:r>
-        <w:rPr>
-          <w:rFonts w:cstheme="minorHAnsi"/>
-          <w:sz w:val="40"/>
-          <w:szCs w:val="40"/>
-        </w:rPr>
-        <w:t xml:space="preserve"> small </w:t>
-      </w:r>
-      <w:proofErr w:type="gramStart"/>
-      <w:r>
-        <w:rPr>
-          <w:rFonts w:cstheme="minorHAnsi"/>
-          <w:sz w:val="40"/>
-          <w:szCs w:val="40"/>
-        </w:rPr>
-        <w:t>amount</w:t>
-      </w:r>
-      <w:proofErr w:type="gramEnd"/>
-      <w:r>
-        <w:rPr>
-          <w:rFonts w:cstheme="minorHAnsi"/>
-          <w:sz w:val="40"/>
-          <w:szCs w:val="40"/>
-        </w:rPr>
-        <w:t xml:space="preserve"> of data over long distances using very little power. </w:t>
+        <w:t xml:space="preserve">LoRa (Long Range) is a technology developed for send small amount of data over long distances using very little power. </w:t>
       </w:r>
     </w:p>
     <w:p>
@@ -2391,25 +2095,7 @@
           <w:sz w:val="40"/>
           <w:szCs w:val="40"/>
         </w:rPr>
-        <w:t xml:space="preserve">When a user </w:t>
-      </w:r>
-      <w:proofErr w:type="gramStart"/>
-      <w:r>
-        <w:rPr>
-          <w:rFonts w:cstheme="minorHAnsi"/>
-          <w:sz w:val="40"/>
-          <w:szCs w:val="40"/>
-        </w:rPr>
-        <w:t>send</w:t>
-      </w:r>
-      <w:proofErr w:type="gramEnd"/>
-      <w:r>
-        <w:rPr>
-          <w:rFonts w:cstheme="minorHAnsi"/>
-          <w:sz w:val="40"/>
-          <w:szCs w:val="40"/>
-        </w:rPr>
-        <w:t xml:space="preserve"> a </w:t>
+        <w:t xml:space="preserve">When a user send a </w:t>
       </w:r>
       <w:proofErr w:type="spellStart"/>
       <w:r>
@@ -2427,41 +2113,24 @@
           <w:sz w:val="40"/>
           <w:szCs w:val="40"/>
         </w:rPr>
-        <w:t xml:space="preserve"> message through their mobile phone, the application formats the message and combines </w:t>
-      </w:r>
-      <w:proofErr w:type="gramStart"/>
-      <w:r>
-        <w:rPr>
-          <w:rFonts w:cstheme="minorHAnsi"/>
-          <w:sz w:val="40"/>
-          <w:szCs w:val="40"/>
-        </w:rPr>
-        <w:t>users</w:t>
-      </w:r>
-      <w:proofErr w:type="gramEnd"/>
-      <w:r>
-        <w:rPr>
-          <w:rFonts w:cstheme="minorHAnsi"/>
-          <w:sz w:val="40"/>
-          <w:szCs w:val="40"/>
-        </w:rPr>
-        <w:t xml:space="preserve"> current location with the GPS sensor in their phone. And send it via BLE to the microcontroller. </w:t>
-      </w:r>
-    </w:p>
-    <w:p>
-      <w:pPr>
-        <w:rPr>
-          <w:rFonts w:cstheme="minorHAnsi"/>
-          <w:sz w:val="40"/>
-          <w:szCs w:val="40"/>
-        </w:rPr>
-      </w:pPr>
-      <w:r>
-        <w:rPr>
-          <w:rFonts w:cstheme="minorHAnsi"/>
-          <w:sz w:val="40"/>
-          <w:szCs w:val="40"/>
-        </w:rPr>
+        <w:t xml:space="preserve"> message through their mobile phone, the application formats the message and combines users current location with the GPS sensor in their phone. And send it via BLE to the microcontroller. </w:t>
+      </w:r>
+    </w:p>
+    <w:p>
+      <w:pPr>
+        <w:rPr>
+          <w:rFonts w:cstheme="minorHAnsi"/>
+          <w:sz w:val="40"/>
+          <w:szCs w:val="40"/>
+        </w:rPr>
+      </w:pPr>
+      <w:r>
+        <w:rPr>
+          <w:rFonts w:cstheme="minorHAnsi"/>
+          <w:sz w:val="40"/>
+          <w:szCs w:val="40"/>
+        </w:rPr>
+        <w:lastRenderedPageBreak/>
         <w:t>Microcontroller forwards the exact BLE message with the LoRa module to the air.</w:t>
       </w:r>
     </w:p>
@@ -2481,485 +2150,313 @@
           <w:szCs w:val="40"/>
           <w:u w:val="single"/>
         </w:rPr>
+        <w:t>Case 1</w:t>
+      </w:r>
+    </w:p>
+    <w:p>
+      <w:pPr>
+        <w:rPr>
+          <w:rFonts w:cstheme="minorHAnsi"/>
+          <w:sz w:val="40"/>
+          <w:szCs w:val="40"/>
+        </w:rPr>
+      </w:pPr>
+      <w:r>
+        <w:rPr>
+          <w:rFonts w:cstheme="minorHAnsi"/>
+          <w:sz w:val="40"/>
+          <w:szCs w:val="40"/>
+        </w:rPr>
+        <w:t xml:space="preserve">If the disaster relief </w:t>
+      </w:r>
+      <w:r>
+        <w:rPr>
+          <w:rFonts w:cstheme="minorHAnsi"/>
+          <w:sz w:val="40"/>
+          <w:szCs w:val="40"/>
+        </w:rPr>
+        <w:t>station</w:t>
+      </w:r>
+      <w:r>
+        <w:rPr>
+          <w:rFonts w:cstheme="minorHAnsi"/>
+          <w:sz w:val="40"/>
+          <w:szCs w:val="40"/>
+        </w:rPr>
+        <w:t xml:space="preserve"> is in the range of the Node operator, then the SOS directly hit the LoRa transceiver in the Command Center device in disaster relief station.</w:t>
+      </w:r>
+    </w:p>
+    <w:p>
+      <w:pPr>
+        <w:rPr>
+          <w:rFonts w:cstheme="minorHAnsi"/>
+          <w:sz w:val="40"/>
+          <w:szCs w:val="40"/>
+          <w:u w:val="single"/>
+        </w:rPr>
+      </w:pPr>
+      <w:r>
+        <w:rPr>
+          <w:rFonts w:cstheme="minorHAnsi"/>
+          <w:sz w:val="40"/>
+          <w:szCs w:val="40"/>
+          <w:u w:val="single"/>
+        </w:rPr>
+        <w:t>Case 2</w:t>
+      </w:r>
+    </w:p>
+    <w:p>
+      <w:pPr>
+        <w:rPr>
+          <w:rFonts w:cstheme="minorHAnsi"/>
+          <w:sz w:val="40"/>
+          <w:szCs w:val="40"/>
+        </w:rPr>
+      </w:pPr>
+      <w:r>
+        <w:rPr>
+          <w:rFonts w:cstheme="minorHAnsi"/>
+          <w:sz w:val="40"/>
+          <w:szCs w:val="40"/>
+        </w:rPr>
+        <w:t>If the disaster relief center is not in the range and if there is another Node in the range then the data packet hits that LoRa module, check where it come from and add the data packet where it landed and again release it into the air. And this process repeats until the data packet hit the command center.</w:t>
+      </w:r>
+    </w:p>
+    <w:p>
+      <w:pPr>
+        <w:rPr>
+          <w:rFonts w:cstheme="minorHAnsi"/>
+          <w:sz w:val="40"/>
+          <w:szCs w:val="40"/>
+        </w:rPr>
+      </w:pPr>
+      <w:r>
+        <w:rPr>
+          <w:rFonts w:cstheme="minorHAnsi"/>
+          <w:sz w:val="40"/>
+          <w:szCs w:val="40"/>
+        </w:rPr>
+        <w:t>Finaly after the data packet received to the command center computer</w:t>
+      </w:r>
+      <w:r>
+        <w:rPr>
+          <w:rFonts w:cstheme="minorHAnsi"/>
+          <w:sz w:val="40"/>
+          <w:szCs w:val="40"/>
+        </w:rPr>
+        <w:t xml:space="preserve">, </w:t>
+      </w:r>
+      <w:r>
+        <w:rPr>
+          <w:rFonts w:cstheme="minorHAnsi"/>
+          <w:sz w:val="40"/>
+          <w:szCs w:val="40"/>
+        </w:rPr>
+        <w:t xml:space="preserve">it processes the data packet and extract where it comes from, what is the emergency type, </w:t>
+      </w:r>
+      <w:r>
+        <w:rPr>
+          <w:rFonts w:cstheme="minorHAnsi"/>
+          <w:sz w:val="40"/>
+          <w:szCs w:val="40"/>
+        </w:rPr>
+        <w:t xml:space="preserve">and updates it in the map window. Then it sends a message that the </w:t>
+      </w:r>
+      <w:proofErr w:type="spellStart"/>
+      <w:r>
+        <w:rPr>
+          <w:rFonts w:cstheme="minorHAnsi"/>
+          <w:sz w:val="40"/>
+          <w:szCs w:val="40"/>
+        </w:rPr>
+        <w:t>sos</w:t>
+      </w:r>
+      <w:proofErr w:type="spellEnd"/>
+      <w:r>
+        <w:rPr>
+          <w:rFonts w:cstheme="minorHAnsi"/>
+          <w:sz w:val="40"/>
+          <w:szCs w:val="40"/>
+        </w:rPr>
+        <w:t xml:space="preserve"> has been received. That message also hops between other nodes and hit the target node.</w:t>
+      </w:r>
+    </w:p>
+    <w:p>
+      <w:pPr>
+        <w:rPr>
+          <w:rFonts w:asciiTheme="majorHAnsi" w:hAnsiTheme="majorHAnsi" w:cstheme="majorHAnsi"/>
+          <w:color w:val="4472C4" w:themeColor="accent1"/>
+          <w:sz w:val="40"/>
+          <w:szCs w:val="40"/>
+        </w:rPr>
+      </w:pPr>
+    </w:p>
+    <w:p>
+      <w:pPr>
+        <w:rPr>
+          <w:rFonts w:asciiTheme="majorHAnsi" w:hAnsiTheme="majorHAnsi" w:cstheme="majorHAnsi"/>
+          <w:color w:val="4472C4" w:themeColor="accent1"/>
+          <w:sz w:val="40"/>
+          <w:szCs w:val="40"/>
+        </w:rPr>
+      </w:pPr>
+      <w:r>
+        <w:rPr>
+          <w:rFonts w:asciiTheme="majorHAnsi" w:hAnsiTheme="majorHAnsi" w:cstheme="majorHAnsi"/>
+          <w:color w:val="4472C4" w:themeColor="accent1"/>
+          <w:sz w:val="40"/>
+          <w:szCs w:val="40"/>
+        </w:rPr>
+        <w:t>How</w:t>
+      </w:r>
+      <w:r>
+        <w:rPr>
+          <w:rFonts w:asciiTheme="majorHAnsi" w:hAnsiTheme="majorHAnsi" w:cstheme="majorHAnsi"/>
+          <w:color w:val="4472C4" w:themeColor="accent1"/>
+          <w:sz w:val="40"/>
+          <w:szCs w:val="40"/>
+        </w:rPr>
+        <w:t xml:space="preserve"> does mesh </w:t>
+      </w:r>
+      <w:r>
+        <w:rPr>
+          <w:rFonts w:asciiTheme="majorHAnsi" w:hAnsiTheme="majorHAnsi" w:cstheme="majorHAnsi"/>
+          <w:color w:val="4472C4" w:themeColor="accent1"/>
+          <w:sz w:val="40"/>
+          <w:szCs w:val="40"/>
+        </w:rPr>
+        <w:t>prevent</w:t>
+      </w:r>
+      <w:r>
+        <w:rPr>
+          <w:rFonts w:asciiTheme="majorHAnsi" w:hAnsiTheme="majorHAnsi" w:cstheme="majorHAnsi"/>
+          <w:color w:val="4472C4" w:themeColor="accent1"/>
+          <w:sz w:val="40"/>
+          <w:szCs w:val="40"/>
+        </w:rPr>
+        <w:t xml:space="preserve"> loops</w:t>
+      </w:r>
+      <w:r>
+        <w:rPr>
+          <w:rFonts w:asciiTheme="majorHAnsi" w:hAnsiTheme="majorHAnsi" w:cstheme="majorHAnsi"/>
+          <w:color w:val="4472C4" w:themeColor="accent1"/>
+          <w:sz w:val="40"/>
+          <w:szCs w:val="40"/>
+        </w:rPr>
+        <w:t>?</w:t>
+      </w:r>
+    </w:p>
+    <w:p>
+      <w:pPr>
+        <w:rPr>
+          <w:rFonts w:cstheme="minorHAnsi"/>
+          <w:sz w:val="40"/>
+          <w:szCs w:val="40"/>
+        </w:rPr>
+      </w:pPr>
+      <w:r>
+        <w:rPr>
+          <w:rFonts w:cstheme="minorHAnsi"/>
+          <w:sz w:val="40"/>
+          <w:szCs w:val="40"/>
+        </w:rPr>
+        <w:t xml:space="preserve">When a </w:t>
+      </w:r>
+      <w:proofErr w:type="spellStart"/>
+      <w:r>
+        <w:rPr>
+          <w:rFonts w:cstheme="minorHAnsi"/>
+          <w:sz w:val="40"/>
+          <w:szCs w:val="40"/>
+        </w:rPr>
+        <w:t>sos</w:t>
+      </w:r>
+      <w:proofErr w:type="spellEnd"/>
+      <w:r>
+        <w:rPr>
+          <w:rFonts w:cstheme="minorHAnsi"/>
+          <w:sz w:val="40"/>
+          <w:szCs w:val="40"/>
+        </w:rPr>
+        <w:t xml:space="preserve"> received to a node, then it checks the node history in the message (during hopping the current node number is combined to the message). If the current node in the node history it means the same message previously transmitted by the node. So it ignores the message.</w:t>
+      </w:r>
+    </w:p>
+    <w:p>
+      <w:pPr>
+        <w:rPr>
+          <w:rFonts w:cstheme="minorHAnsi"/>
+          <w:sz w:val="40"/>
+          <w:szCs w:val="40"/>
+        </w:rPr>
+      </w:pPr>
+      <w:r>
+        <w:rPr>
+          <w:rFonts w:cstheme="minorHAnsi"/>
+          <w:sz w:val="40"/>
+          <w:szCs w:val="40"/>
+        </w:rPr>
+        <w:t>If the same message (detects by checking the time in the message) came from two separate paths, then that message also been transmitted by the node. So that also ignored.</w:t>
+      </w:r>
+    </w:p>
+    <w:p>
+      <w:pPr>
+        <w:rPr>
+          <w:rFonts w:cstheme="minorHAnsi"/>
+          <w:sz w:val="40"/>
+          <w:szCs w:val="40"/>
+        </w:rPr>
+      </w:pPr>
+      <w:r>
+        <w:rPr>
+          <w:rFonts w:cstheme="minorHAnsi"/>
+          <w:sz w:val="40"/>
+          <w:szCs w:val="40"/>
+        </w:rPr>
+        <w:t>When the node</w:t>
+      </w:r>
+      <w:r>
+        <w:rPr>
+          <w:rFonts w:cstheme="minorHAnsi"/>
+          <w:sz w:val="40"/>
+          <w:szCs w:val="40"/>
+        </w:rPr>
+        <w:t xml:space="preserve"> received a message and if the distance from the disaster relief center and the coordinates in the message</w:t>
+      </w:r>
+      <w:r>
+        <w:rPr>
+          <w:rFonts w:cstheme="minorHAnsi"/>
+          <w:sz w:val="40"/>
+          <w:szCs w:val="40"/>
+        </w:rPr>
+        <w:t xml:space="preserve"> (the origin) is lower than the distance between the current node and the disaster relief center then the message get ignored. Because the message is transmitting away from the destination.</w:t>
+      </w:r>
+    </w:p>
+    <w:p>
+      <w:pPr>
+        <w:rPr>
+          <w:rFonts w:cstheme="minorHAnsi"/>
+          <w:sz w:val="40"/>
+          <w:szCs w:val="40"/>
+        </w:rPr>
+      </w:pPr>
+    </w:p>
+    <w:p>
+      <w:pPr>
+        <w:rPr>
+          <w:rFonts w:asciiTheme="majorHAnsi" w:hAnsiTheme="majorHAnsi" w:cstheme="majorHAnsi"/>
+          <w:color w:val="2F5496" w:themeColor="accent1" w:themeShade="BF"/>
+          <w:sz w:val="40"/>
+          <w:szCs w:val="40"/>
+        </w:rPr>
+      </w:pPr>
+      <w:r>
+        <w:rPr>
+          <w:rFonts w:asciiTheme="majorHAnsi" w:hAnsiTheme="majorHAnsi" w:cstheme="majorHAnsi"/>
+          <w:color w:val="2F5496" w:themeColor="accent1" w:themeShade="BF"/>
+          <w:sz w:val="40"/>
+          <w:szCs w:val="40"/>
+        </w:rPr>
         <w:lastRenderedPageBreak/>
-        <w:t>Case 1</w:t>
-      </w:r>
-    </w:p>
-    <w:p>
-      <w:pPr>
-        <w:rPr>
-          <w:rFonts w:cstheme="minorHAnsi"/>
-          <w:sz w:val="40"/>
-          <w:szCs w:val="40"/>
-        </w:rPr>
-      </w:pPr>
-      <w:r>
-        <w:rPr>
-          <w:rFonts w:cstheme="minorHAnsi"/>
-          <w:sz w:val="40"/>
-          <w:szCs w:val="40"/>
-        </w:rPr>
-        <w:t xml:space="preserve">If the disaster relief </w:t>
-      </w:r>
-      <w:r>
-        <w:rPr>
-          <w:rFonts w:cstheme="minorHAnsi"/>
-          <w:sz w:val="40"/>
-          <w:szCs w:val="40"/>
-        </w:rPr>
-        <w:t>station</w:t>
-      </w:r>
-      <w:r>
-        <w:rPr>
-          <w:rFonts w:cstheme="minorHAnsi"/>
-          <w:sz w:val="40"/>
-          <w:szCs w:val="40"/>
-        </w:rPr>
-        <w:t xml:space="preserve"> is in the range of the Node operator, then the SOS directly hit the LoRa transceiver in the Command Center device in disaster relief station.</w:t>
-      </w:r>
-    </w:p>
-    <w:p>
-      <w:pPr>
-        <w:rPr>
-          <w:rFonts w:cstheme="minorHAnsi"/>
-          <w:sz w:val="40"/>
-          <w:szCs w:val="40"/>
-          <w:u w:val="single"/>
-        </w:rPr>
-      </w:pPr>
-      <w:r>
-        <w:rPr>
-          <w:rFonts w:cstheme="minorHAnsi"/>
-          <w:sz w:val="40"/>
-          <w:szCs w:val="40"/>
-          <w:u w:val="single"/>
-        </w:rPr>
-        <w:t>Case 2</w:t>
-      </w:r>
-    </w:p>
-    <w:p>
-      <w:pPr>
-        <w:rPr>
-          <w:rFonts w:cstheme="minorHAnsi"/>
-          <w:sz w:val="40"/>
-          <w:szCs w:val="40"/>
-        </w:rPr>
-      </w:pPr>
-      <w:r>
-        <w:rPr>
-          <w:rFonts w:cstheme="minorHAnsi"/>
-          <w:sz w:val="40"/>
-          <w:szCs w:val="40"/>
-        </w:rPr>
-        <w:t xml:space="preserve">If the disaster relief center is not in the range and if there is another Node in the range then the data packet hits that LoRa module, check where it </w:t>
-      </w:r>
-      <w:proofErr w:type="gramStart"/>
-      <w:r>
-        <w:rPr>
-          <w:rFonts w:cstheme="minorHAnsi"/>
-          <w:sz w:val="40"/>
-          <w:szCs w:val="40"/>
-        </w:rPr>
-        <w:t>come</w:t>
-      </w:r>
-      <w:proofErr w:type="gramEnd"/>
-      <w:r>
-        <w:rPr>
-          <w:rFonts w:cstheme="minorHAnsi"/>
-          <w:sz w:val="40"/>
-          <w:szCs w:val="40"/>
-        </w:rPr>
-        <w:t xml:space="preserve"> from and add the data packet where it landed and again release it into the air. And this process repeats until the data packet </w:t>
-      </w:r>
-      <w:proofErr w:type="gramStart"/>
-      <w:r>
-        <w:rPr>
-          <w:rFonts w:cstheme="minorHAnsi"/>
-          <w:sz w:val="40"/>
-          <w:szCs w:val="40"/>
-        </w:rPr>
-        <w:t>hit</w:t>
-      </w:r>
-      <w:proofErr w:type="gramEnd"/>
-      <w:r>
-        <w:rPr>
-          <w:rFonts w:cstheme="minorHAnsi"/>
-          <w:sz w:val="40"/>
-          <w:szCs w:val="40"/>
-        </w:rPr>
-        <w:t xml:space="preserve"> the command center.</w:t>
-      </w:r>
-    </w:p>
-    <w:p>
-      <w:pPr>
-        <w:rPr>
-          <w:rFonts w:cstheme="minorHAnsi"/>
-          <w:sz w:val="40"/>
-          <w:szCs w:val="40"/>
-        </w:rPr>
-      </w:pPr>
-      <w:r>
-        <w:rPr>
-          <w:rFonts w:cstheme="minorHAnsi"/>
-          <w:sz w:val="40"/>
-          <w:szCs w:val="40"/>
-        </w:rPr>
-        <w:t xml:space="preserve">Finaly after the data packet </w:t>
-      </w:r>
-      <w:proofErr w:type="gramStart"/>
-      <w:r>
-        <w:rPr>
-          <w:rFonts w:cstheme="minorHAnsi"/>
-          <w:sz w:val="40"/>
-          <w:szCs w:val="40"/>
-        </w:rPr>
-        <w:t>received to</w:t>
-      </w:r>
-      <w:proofErr w:type="gramEnd"/>
-      <w:r>
-        <w:rPr>
-          <w:rFonts w:cstheme="minorHAnsi"/>
-          <w:sz w:val="40"/>
-          <w:szCs w:val="40"/>
-        </w:rPr>
-        <w:t xml:space="preserve"> the command center computer</w:t>
-      </w:r>
-      <w:r>
-        <w:rPr>
-          <w:rFonts w:cstheme="minorHAnsi"/>
-          <w:sz w:val="40"/>
-          <w:szCs w:val="40"/>
-        </w:rPr>
-        <w:t xml:space="preserve">, </w:t>
-      </w:r>
-      <w:r>
-        <w:rPr>
-          <w:rFonts w:cstheme="minorHAnsi"/>
-          <w:sz w:val="40"/>
-          <w:szCs w:val="40"/>
-        </w:rPr>
-        <w:t xml:space="preserve">it processes the data packet and </w:t>
-      </w:r>
-      <w:proofErr w:type="gramStart"/>
-      <w:r>
-        <w:rPr>
-          <w:rFonts w:cstheme="minorHAnsi"/>
-          <w:sz w:val="40"/>
-          <w:szCs w:val="40"/>
-        </w:rPr>
-        <w:t>extract</w:t>
-      </w:r>
-      <w:proofErr w:type="gramEnd"/>
-      <w:r>
-        <w:rPr>
-          <w:rFonts w:cstheme="minorHAnsi"/>
-          <w:sz w:val="40"/>
-          <w:szCs w:val="40"/>
-        </w:rPr>
-        <w:t xml:space="preserve"> where it comes from, what is the emergency type, </w:t>
-      </w:r>
-      <w:r>
-        <w:rPr>
-          <w:rFonts w:cstheme="minorHAnsi"/>
-          <w:sz w:val="40"/>
-          <w:szCs w:val="40"/>
-        </w:rPr>
-        <w:t xml:space="preserve">and updates it in the map window. Then it sends a message that the </w:t>
-      </w:r>
-      <w:proofErr w:type="spellStart"/>
-      <w:r>
-        <w:rPr>
-          <w:rFonts w:cstheme="minorHAnsi"/>
-          <w:sz w:val="40"/>
-          <w:szCs w:val="40"/>
-        </w:rPr>
-        <w:t>sos</w:t>
-      </w:r>
-      <w:proofErr w:type="spellEnd"/>
-      <w:r>
-        <w:rPr>
-          <w:rFonts w:cstheme="minorHAnsi"/>
-          <w:sz w:val="40"/>
-          <w:szCs w:val="40"/>
-        </w:rPr>
-        <w:t xml:space="preserve"> has been received. That message also hops between other nodes and </w:t>
-      </w:r>
-      <w:proofErr w:type="gramStart"/>
-      <w:r>
-        <w:rPr>
-          <w:rFonts w:cstheme="minorHAnsi"/>
-          <w:sz w:val="40"/>
-          <w:szCs w:val="40"/>
-        </w:rPr>
-        <w:t>hit</w:t>
-      </w:r>
-      <w:proofErr w:type="gramEnd"/>
-      <w:r>
-        <w:rPr>
-          <w:rFonts w:cstheme="minorHAnsi"/>
-          <w:sz w:val="40"/>
-          <w:szCs w:val="40"/>
-        </w:rPr>
-        <w:t xml:space="preserve"> the target node.</w:t>
-      </w:r>
-    </w:p>
-    <w:p>
-      <w:pPr>
-        <w:rPr>
-          <w:rFonts w:asciiTheme="majorHAnsi" w:hAnsiTheme="majorHAnsi" w:cstheme="majorHAnsi"/>
-          <w:color w:val="4472C4" w:themeColor="accent1"/>
-          <w:sz w:val="40"/>
-          <w:szCs w:val="40"/>
-        </w:rPr>
-      </w:pPr>
-    </w:p>
-    <w:p>
-      <w:pPr>
-        <w:rPr>
-          <w:rFonts w:asciiTheme="majorHAnsi" w:hAnsiTheme="majorHAnsi" w:cstheme="majorHAnsi"/>
-          <w:color w:val="4472C4" w:themeColor="accent1"/>
-          <w:sz w:val="40"/>
-          <w:szCs w:val="40"/>
-        </w:rPr>
-      </w:pPr>
-      <w:r>
-        <w:rPr>
-          <w:rFonts w:asciiTheme="majorHAnsi" w:hAnsiTheme="majorHAnsi" w:cstheme="majorHAnsi"/>
-          <w:color w:val="4472C4" w:themeColor="accent1"/>
-          <w:sz w:val="40"/>
-          <w:szCs w:val="40"/>
-        </w:rPr>
-        <w:t>How</w:t>
-      </w:r>
-      <w:r>
-        <w:rPr>
-          <w:rFonts w:asciiTheme="majorHAnsi" w:hAnsiTheme="majorHAnsi" w:cstheme="majorHAnsi"/>
-          <w:color w:val="4472C4" w:themeColor="accent1"/>
-          <w:sz w:val="40"/>
-          <w:szCs w:val="40"/>
-        </w:rPr>
-        <w:t xml:space="preserve"> does mesh </w:t>
-      </w:r>
-      <w:r>
-        <w:rPr>
-          <w:rFonts w:asciiTheme="majorHAnsi" w:hAnsiTheme="majorHAnsi" w:cstheme="majorHAnsi"/>
-          <w:color w:val="4472C4" w:themeColor="accent1"/>
-          <w:sz w:val="40"/>
-          <w:szCs w:val="40"/>
-        </w:rPr>
-        <w:t>prevent</w:t>
-      </w:r>
-      <w:r>
-        <w:rPr>
-          <w:rFonts w:asciiTheme="majorHAnsi" w:hAnsiTheme="majorHAnsi" w:cstheme="majorHAnsi"/>
-          <w:color w:val="4472C4" w:themeColor="accent1"/>
-          <w:sz w:val="40"/>
-          <w:szCs w:val="40"/>
-        </w:rPr>
-        <w:t xml:space="preserve"> loops</w:t>
-      </w:r>
-      <w:r>
-        <w:rPr>
-          <w:rFonts w:asciiTheme="majorHAnsi" w:hAnsiTheme="majorHAnsi" w:cstheme="majorHAnsi"/>
-          <w:color w:val="4472C4" w:themeColor="accent1"/>
-          <w:sz w:val="40"/>
-          <w:szCs w:val="40"/>
-        </w:rPr>
-        <w:t>?</w:t>
-      </w:r>
-    </w:p>
-    <w:p>
-      <w:pPr>
-        <w:rPr>
-          <w:rFonts w:cstheme="minorHAnsi"/>
-          <w:sz w:val="40"/>
-          <w:szCs w:val="40"/>
-        </w:rPr>
-      </w:pPr>
-      <w:r>
-        <w:rPr>
-          <w:rFonts w:cstheme="minorHAnsi"/>
-          <w:sz w:val="40"/>
-          <w:szCs w:val="40"/>
-        </w:rPr>
-        <w:lastRenderedPageBreak/>
-        <w:t xml:space="preserve">When a </w:t>
-      </w:r>
-      <w:proofErr w:type="spellStart"/>
-      <w:r>
-        <w:rPr>
-          <w:rFonts w:cstheme="minorHAnsi"/>
-          <w:sz w:val="40"/>
-          <w:szCs w:val="40"/>
-        </w:rPr>
-        <w:t>sos</w:t>
-      </w:r>
-      <w:proofErr w:type="spellEnd"/>
-      <w:r>
-        <w:rPr>
-          <w:rFonts w:cstheme="minorHAnsi"/>
-          <w:sz w:val="40"/>
-          <w:szCs w:val="40"/>
-        </w:rPr>
-        <w:t xml:space="preserve"> received to a node, then it checks the node history in the message (during hopping the current node number is combined to the message). If the current node in the node </w:t>
-      </w:r>
-      <w:proofErr w:type="gramStart"/>
-      <w:r>
-        <w:rPr>
-          <w:rFonts w:cstheme="minorHAnsi"/>
-          <w:sz w:val="40"/>
-          <w:szCs w:val="40"/>
-        </w:rPr>
-        <w:t>history</w:t>
-      </w:r>
-      <w:proofErr w:type="gramEnd"/>
-      <w:r>
-        <w:rPr>
-          <w:rFonts w:cstheme="minorHAnsi"/>
-          <w:sz w:val="40"/>
-          <w:szCs w:val="40"/>
-        </w:rPr>
-        <w:t xml:space="preserve"> it means the same message previously transmitted by the node. </w:t>
-      </w:r>
-      <w:proofErr w:type="gramStart"/>
-      <w:r>
-        <w:rPr>
-          <w:rFonts w:cstheme="minorHAnsi"/>
-          <w:sz w:val="40"/>
-          <w:szCs w:val="40"/>
-        </w:rPr>
-        <w:t>So</w:t>
-      </w:r>
-      <w:proofErr w:type="gramEnd"/>
-      <w:r>
-        <w:rPr>
-          <w:rFonts w:cstheme="minorHAnsi"/>
-          <w:sz w:val="40"/>
-          <w:szCs w:val="40"/>
-        </w:rPr>
-        <w:t xml:space="preserve"> it ignores the message.</w:t>
-      </w:r>
-    </w:p>
-    <w:p>
-      <w:pPr>
-        <w:rPr>
-          <w:rFonts w:cstheme="minorHAnsi"/>
-          <w:sz w:val="40"/>
-          <w:szCs w:val="40"/>
-        </w:rPr>
-      </w:pPr>
-      <w:r>
-        <w:rPr>
-          <w:rFonts w:cstheme="minorHAnsi"/>
-          <w:sz w:val="40"/>
-          <w:szCs w:val="40"/>
-        </w:rPr>
-        <w:t xml:space="preserve">If the same message (detects by checking the time in the message) came from two separate paths, then that message also been transmitted by the node. So that </w:t>
-      </w:r>
-      <w:proofErr w:type="gramStart"/>
-      <w:r>
-        <w:rPr>
-          <w:rFonts w:cstheme="minorHAnsi"/>
-          <w:sz w:val="40"/>
-          <w:szCs w:val="40"/>
-        </w:rPr>
-        <w:t>also</w:t>
-      </w:r>
-      <w:proofErr w:type="gramEnd"/>
-      <w:r>
-        <w:rPr>
-          <w:rFonts w:cstheme="minorHAnsi"/>
-          <w:sz w:val="40"/>
-          <w:szCs w:val="40"/>
-        </w:rPr>
-        <w:t xml:space="preserve"> ignored.</w:t>
-      </w:r>
-    </w:p>
-    <w:p>
-      <w:pPr>
-        <w:rPr>
-          <w:rFonts w:cstheme="minorHAnsi"/>
-          <w:sz w:val="40"/>
-          <w:szCs w:val="40"/>
-        </w:rPr>
-      </w:pPr>
-      <w:r>
-        <w:rPr>
-          <w:rFonts w:cstheme="minorHAnsi"/>
-          <w:sz w:val="40"/>
-          <w:szCs w:val="40"/>
-        </w:rPr>
-        <w:t>When the node</w:t>
-      </w:r>
-      <w:r>
-        <w:rPr>
-          <w:rFonts w:cstheme="minorHAnsi"/>
-          <w:sz w:val="40"/>
-          <w:szCs w:val="40"/>
-        </w:rPr>
-        <w:t xml:space="preserve"> </w:t>
-      </w:r>
-      <w:proofErr w:type="gramStart"/>
-      <w:r>
-        <w:rPr>
-          <w:rFonts w:cstheme="minorHAnsi"/>
-          <w:sz w:val="40"/>
-          <w:szCs w:val="40"/>
-        </w:rPr>
-        <w:t>received</w:t>
-      </w:r>
-      <w:proofErr w:type="gramEnd"/>
-      <w:r>
-        <w:rPr>
-          <w:rFonts w:cstheme="minorHAnsi"/>
-          <w:sz w:val="40"/>
-          <w:szCs w:val="40"/>
-        </w:rPr>
-        <w:t xml:space="preserve"> a message and if the distance from the disaster relief center and the coordinates in the message</w:t>
-      </w:r>
-      <w:r>
-        <w:rPr>
-          <w:rFonts w:cstheme="minorHAnsi"/>
-          <w:sz w:val="40"/>
-          <w:szCs w:val="40"/>
-        </w:rPr>
-        <w:t xml:space="preserve"> (the origin) is lower than the distance between the current node and the disaster relief center then the message </w:t>
-      </w:r>
-      <w:proofErr w:type="gramStart"/>
-      <w:r>
-        <w:rPr>
-          <w:rFonts w:cstheme="minorHAnsi"/>
-          <w:sz w:val="40"/>
-          <w:szCs w:val="40"/>
-        </w:rPr>
-        <w:t>get</w:t>
-      </w:r>
-      <w:proofErr w:type="gramEnd"/>
-      <w:r>
-        <w:rPr>
-          <w:rFonts w:cstheme="minorHAnsi"/>
-          <w:sz w:val="40"/>
-          <w:szCs w:val="40"/>
-        </w:rPr>
-        <w:t xml:space="preserve"> ignored. Because the message is transmitting away from the destination.</w:t>
-      </w:r>
-    </w:p>
-    <w:p>
-      <w:pPr>
-        <w:rPr>
-          <w:rFonts w:asciiTheme="majorHAnsi" w:hAnsiTheme="majorHAnsi" w:cstheme="majorHAnsi"/>
-          <w:color w:val="2F5496" w:themeColor="accent1" w:themeShade="BF"/>
-          <w:sz w:val="40"/>
-          <w:szCs w:val="40"/>
-        </w:rPr>
-      </w:pPr>
-      <w:r>
-        <w:rPr>
-          <w:rFonts w:asciiTheme="majorHAnsi" w:hAnsiTheme="majorHAnsi" w:cstheme="majorHAnsi"/>
-          <w:color w:val="2F5496" w:themeColor="accent1" w:themeShade="BF"/>
-          <w:sz w:val="40"/>
-          <w:szCs w:val="40"/>
-        </w:rPr>
         <w:t>Hardware</w:t>
       </w:r>
     </w:p>
@@ -3001,12 +2498,6 @@
         <w:gridCol w:w="4332"/>
       </w:tblGrid>
       <w:tr>
-        <w:tblPrEx>
-          <w:tblCellMar>
-            <w:top w:w="0" w:type="dxa"/>
-            <w:bottom w:w="0" w:type="dxa"/>
-          </w:tblCellMar>
-        </w:tblPrEx>
         <w:trPr>
           <w:trHeight w:val="3525"/>
         </w:trPr>
@@ -3033,7 +2524,6 @@
                 <w:sz w:val="36"/>
                 <w:szCs w:val="36"/>
               </w:rPr>
-              <w:lastRenderedPageBreak/>
               <w:t>ESP32 microcontroller</w:t>
             </w:r>
           </w:p>
@@ -3144,43 +2634,15 @@
                 <w:sz w:val="36"/>
                 <w:szCs w:val="36"/>
               </w:rPr>
-              <w:t xml:space="preserve">For </w:t>
+              <w:t xml:space="preserve">For handle Bluetooth connectivity and </w:t>
             </w:r>
-            <w:proofErr w:type="gramStart"/>
             <w:r>
               <w:rPr>
                 <w:rFonts w:cstheme="minorHAnsi"/>
                 <w:sz w:val="36"/>
                 <w:szCs w:val="36"/>
               </w:rPr>
-              <w:t>handle</w:t>
-            </w:r>
-            <w:proofErr w:type="gramEnd"/>
-            <w:r>
-              <w:rPr>
-                <w:rFonts w:cstheme="minorHAnsi"/>
-                <w:sz w:val="36"/>
-                <w:szCs w:val="36"/>
-              </w:rPr>
-              <w:t xml:space="preserve"> Bluetooth connectivity and </w:t>
-            </w:r>
-            <w:proofErr w:type="gramStart"/>
-            <w:r>
-              <w:rPr>
-                <w:rFonts w:cstheme="minorHAnsi"/>
-                <w:sz w:val="36"/>
-                <w:szCs w:val="36"/>
-              </w:rPr>
-              <w:t>control</w:t>
-            </w:r>
-            <w:proofErr w:type="gramEnd"/>
-            <w:r>
-              <w:rPr>
-                <w:rFonts w:cstheme="minorHAnsi"/>
-                <w:sz w:val="36"/>
-                <w:szCs w:val="36"/>
-              </w:rPr>
-              <w:t xml:space="preserve"> LoRa module</w:t>
+              <w:t>control LoRa module</w:t>
             </w:r>
           </w:p>
           <w:p>
@@ -3270,12 +2732,6 @@
         <w:gridCol w:w="5442"/>
       </w:tblGrid>
       <w:tr>
-        <w:tblPrEx>
-          <w:tblCellMar>
-            <w:top w:w="0" w:type="dxa"/>
-            <w:bottom w:w="0" w:type="dxa"/>
-          </w:tblCellMar>
-        </w:tblPrEx>
         <w:trPr>
           <w:trHeight w:val="2676"/>
         </w:trPr>
@@ -3355,43 +2811,7 @@
                 <w:sz w:val="36"/>
                 <w:szCs w:val="36"/>
               </w:rPr>
-              <w:t xml:space="preserve">For </w:t>
-            </w:r>
-            <w:proofErr w:type="gramStart"/>
-            <w:r>
-              <w:rPr>
-                <w:rFonts w:cstheme="minorHAnsi"/>
-                <w:sz w:val="36"/>
-                <w:szCs w:val="36"/>
-              </w:rPr>
-              <w:t>handle</w:t>
-            </w:r>
-            <w:proofErr w:type="gramEnd"/>
-            <w:r>
-              <w:rPr>
-                <w:rFonts w:cstheme="minorHAnsi"/>
-                <w:sz w:val="36"/>
-                <w:szCs w:val="36"/>
-              </w:rPr>
-              <w:t xml:space="preserve"> massive </w:t>
-            </w:r>
-            <w:proofErr w:type="gramStart"/>
-            <w:r>
-              <w:rPr>
-                <w:rFonts w:cstheme="minorHAnsi"/>
-                <w:sz w:val="36"/>
-                <w:szCs w:val="36"/>
-              </w:rPr>
-              <w:t>number</w:t>
-            </w:r>
-            <w:proofErr w:type="gramEnd"/>
-            <w:r>
-              <w:rPr>
-                <w:rFonts w:cstheme="minorHAnsi"/>
-                <w:sz w:val="36"/>
-                <w:szCs w:val="36"/>
-              </w:rPr>
-              <w:t xml:space="preserve"> of data coming from </w:t>
+              <w:t xml:space="preserve">For handle massive number of data coming from </w:t>
             </w:r>
             <w:r>
               <w:rPr>
@@ -3419,25 +2839,6 @@
           <w:rFonts w:asciiTheme="majorHAnsi" w:hAnsiTheme="majorHAnsi" w:cstheme="majorHAnsi"/>
           <w:sz w:val="40"/>
           <w:szCs w:val="40"/>
-        </w:rPr>
-      </w:pPr>
-    </w:p>
-    <w:p>
-      <w:pPr>
-        <w:rPr>
-          <w:rFonts w:asciiTheme="majorHAnsi" w:hAnsiTheme="majorHAnsi" w:cstheme="majorHAnsi"/>
-          <w:sz w:val="40"/>
-          <w:szCs w:val="40"/>
-          <w:u w:val="single"/>
-        </w:rPr>
-      </w:pPr>
-    </w:p>
-    <w:p>
-      <w:pPr>
-        <w:rPr>
-          <w:rFonts w:asciiTheme="majorHAnsi" w:hAnsiTheme="majorHAnsi" w:cstheme="majorHAnsi"/>
-          <w:sz w:val="40"/>
-          <w:szCs w:val="40"/>
           <w:u w:val="single"/>
         </w:rPr>
       </w:pPr>
@@ -3472,6 +2873,7 @@
       <w:r>
         <w:rPr>
           <w:rFonts w:asciiTheme="majorHAnsi" w:hAnsiTheme="majorHAnsi" w:cstheme="majorHAnsi"/>
+          <w:noProof/>
           <w:sz w:val="40"/>
           <w:szCs w:val="40"/>
         </w:rPr>
@@ -3532,6 +2934,7 @@
       <w:r>
         <w:rPr>
           <w:rFonts w:asciiTheme="majorHAnsi" w:hAnsiTheme="majorHAnsi" w:cstheme="majorHAnsi"/>
+          <w:noProof/>
           <w:sz w:val="40"/>
           <w:szCs w:val="40"/>
         </w:rPr>
@@ -3601,156 +3004,120 @@
           <w:szCs w:val="40"/>
         </w:rPr>
       </w:pPr>
-    </w:p>
-    <w:p>
-      <w:pPr>
-        <w:rPr>
-          <w:rFonts w:asciiTheme="majorHAnsi" w:hAnsiTheme="majorHAnsi" w:cstheme="majorHAnsi"/>
+      <w:r>
+        <w:rPr>
+          <w:rFonts w:asciiTheme="majorHAnsi" w:hAnsiTheme="majorHAnsi" w:cstheme="majorHAnsi"/>
+          <w:noProof/>
           <w:color w:val="4472C4" w:themeColor="accent1"/>
           <w:sz w:val="40"/>
           <w:szCs w:val="40"/>
         </w:rPr>
-      </w:pPr>
-    </w:p>
-    <w:p>
-      <w:pPr>
-        <w:rPr>
-          <w:rFonts w:asciiTheme="majorHAnsi" w:hAnsiTheme="majorHAnsi" w:cstheme="majorHAnsi"/>
+        <w:drawing>
+          <wp:inline distT="0" distB="0" distL="0" distR="0" wp14:anchorId="2F3CDC5E" wp14:editId="0072DCD1">
+            <wp:extent cx="5527964" cy="3689645"/>
+            <wp:effectExtent l="0" t="0" r="0" b="6350"/>
+            <wp:docPr id="1995304510" name="Picture 11"/>
+            <wp:cNvGraphicFramePr>
+              <a:graphicFrameLocks xmlns:a="http://schemas.openxmlformats.org/drawingml/2006/main" noChangeAspect="1"/>
+            </wp:cNvGraphicFramePr>
+            <a:graphic xmlns:a="http://schemas.openxmlformats.org/drawingml/2006/main">
+              <a:graphicData uri="http://schemas.openxmlformats.org/drawingml/2006/picture">
+                <pic:pic xmlns:pic="http://schemas.openxmlformats.org/drawingml/2006/picture">
+                  <pic:nvPicPr>
+                    <pic:cNvPr id="0" name="Picture 6"/>
+                    <pic:cNvPicPr>
+                      <a:picLocks noChangeAspect="1" noChangeArrowheads="1"/>
+                    </pic:cNvPicPr>
+                  </pic:nvPicPr>
+                  <pic:blipFill>
+                    <a:blip r:embed="rId10" cstate="print">
+                      <a:extLst>
+                        <a:ext uri="{28A0092B-C50C-407E-A947-70E740481C1C}">
+                          <a14:useLocalDpi xmlns:a14="http://schemas.microsoft.com/office/drawing/2010/main" val="0"/>
+                        </a:ext>
+                      </a:extLst>
+                    </a:blip>
+                    <a:srcRect/>
+                    <a:stretch>
+                      <a:fillRect/>
+                    </a:stretch>
+                  </pic:blipFill>
+                  <pic:spPr bwMode="auto">
+                    <a:xfrm>
+                      <a:off x="0" y="0"/>
+                      <a:ext cx="5531527" cy="3692023"/>
+                    </a:xfrm>
+                    <a:prstGeom prst="rect">
+                      <a:avLst/>
+                    </a:prstGeom>
+                    <a:noFill/>
+                    <a:ln>
+                      <a:noFill/>
+                    </a:ln>
+                  </pic:spPr>
+                </pic:pic>
+              </a:graphicData>
+            </a:graphic>
+          </wp:inline>
+        </w:drawing>
+      </w:r>
+      <w:r>
+        <w:rPr>
+          <w:rFonts w:asciiTheme="majorHAnsi" w:hAnsiTheme="majorHAnsi" w:cstheme="majorHAnsi"/>
+          <w:noProof/>
           <w:color w:val="4472C4" w:themeColor="accent1"/>
           <w:sz w:val="40"/>
           <w:szCs w:val="40"/>
         </w:rPr>
-      </w:pPr>
-    </w:p>
-    <w:p>
-      <w:pPr>
-        <w:rPr>
-          <w:rFonts w:asciiTheme="majorHAnsi" w:hAnsiTheme="majorHAnsi" w:cstheme="majorHAnsi"/>
-          <w:color w:val="4472C4" w:themeColor="accent1"/>
-          <w:sz w:val="40"/>
-          <w:szCs w:val="40"/>
-        </w:rPr>
-      </w:pPr>
-    </w:p>
-    <w:p>
-      <w:pPr>
-        <w:rPr>
-          <w:rFonts w:asciiTheme="majorHAnsi" w:hAnsiTheme="majorHAnsi" w:cstheme="majorHAnsi"/>
-          <w:color w:val="4472C4" w:themeColor="accent1"/>
-          <w:sz w:val="40"/>
-          <w:szCs w:val="40"/>
-        </w:rPr>
-      </w:pPr>
-    </w:p>
-    <w:p>
-      <w:pPr>
-        <w:rPr>
-          <w:rFonts w:asciiTheme="majorHAnsi" w:hAnsiTheme="majorHAnsi" w:cstheme="majorHAnsi"/>
-          <w:color w:val="4472C4" w:themeColor="accent1"/>
-          <w:sz w:val="40"/>
-          <w:szCs w:val="40"/>
-        </w:rPr>
-      </w:pPr>
-    </w:p>
-    <w:p>
-      <w:pPr>
-        <w:rPr>
-          <w:rFonts w:asciiTheme="majorHAnsi" w:hAnsiTheme="majorHAnsi" w:cstheme="majorHAnsi"/>
-          <w:color w:val="4472C4" w:themeColor="accent1"/>
-          <w:sz w:val="40"/>
-          <w:szCs w:val="40"/>
-        </w:rPr>
-      </w:pPr>
-    </w:p>
-    <w:p>
-      <w:pPr>
-        <w:rPr>
-          <w:rFonts w:asciiTheme="majorHAnsi" w:hAnsiTheme="majorHAnsi" w:cstheme="majorHAnsi"/>
-          <w:color w:val="4472C4" w:themeColor="accent1"/>
-          <w:sz w:val="40"/>
-          <w:szCs w:val="40"/>
-        </w:rPr>
-      </w:pPr>
-    </w:p>
-    <w:p>
-      <w:pPr>
-        <w:rPr>
-          <w:rFonts w:asciiTheme="majorHAnsi" w:hAnsiTheme="majorHAnsi" w:cstheme="majorHAnsi"/>
-          <w:color w:val="4472C4" w:themeColor="accent1"/>
-          <w:sz w:val="40"/>
-          <w:szCs w:val="40"/>
-        </w:rPr>
-      </w:pPr>
-    </w:p>
-    <w:p>
-      <w:pPr>
-        <w:rPr>
-          <w:rFonts w:asciiTheme="majorHAnsi" w:hAnsiTheme="majorHAnsi" w:cstheme="majorHAnsi"/>
-          <w:color w:val="4472C4" w:themeColor="accent1"/>
-          <w:sz w:val="40"/>
-          <w:szCs w:val="40"/>
-        </w:rPr>
-      </w:pPr>
-    </w:p>
-    <w:p>
-      <w:pPr>
-        <w:rPr>
-          <w:rFonts w:asciiTheme="majorHAnsi" w:hAnsiTheme="majorHAnsi" w:cstheme="majorHAnsi"/>
-          <w:color w:val="4472C4" w:themeColor="accent1"/>
-          <w:sz w:val="40"/>
-          <w:szCs w:val="40"/>
-        </w:rPr>
-      </w:pPr>
-    </w:p>
-    <w:p>
-      <w:pPr>
-        <w:rPr>
-          <w:rFonts w:asciiTheme="majorHAnsi" w:hAnsiTheme="majorHAnsi" w:cstheme="majorHAnsi"/>
-          <w:color w:val="4472C4" w:themeColor="accent1"/>
-          <w:sz w:val="40"/>
-          <w:szCs w:val="40"/>
-        </w:rPr>
-      </w:pPr>
-    </w:p>
-    <w:p>
-      <w:pPr>
-        <w:rPr>
-          <w:rFonts w:asciiTheme="majorHAnsi" w:hAnsiTheme="majorHAnsi" w:cstheme="majorHAnsi"/>
-          <w:color w:val="4472C4" w:themeColor="accent1"/>
-          <w:sz w:val="40"/>
-          <w:szCs w:val="40"/>
-        </w:rPr>
-      </w:pPr>
-    </w:p>
-    <w:p>
-      <w:pPr>
-        <w:rPr>
-          <w:rFonts w:asciiTheme="majorHAnsi" w:hAnsiTheme="majorHAnsi" w:cstheme="majorHAnsi"/>
-          <w:color w:val="4472C4" w:themeColor="accent1"/>
-          <w:sz w:val="40"/>
-          <w:szCs w:val="40"/>
-        </w:rPr>
-      </w:pPr>
-    </w:p>
-    <w:p>
-      <w:pPr>
-        <w:rPr>
-          <w:rFonts w:asciiTheme="majorHAnsi" w:hAnsiTheme="majorHAnsi" w:cstheme="majorHAnsi"/>
-          <w:color w:val="4472C4" w:themeColor="accent1"/>
-          <w:sz w:val="40"/>
-          <w:szCs w:val="40"/>
-        </w:rPr>
-      </w:pPr>
-    </w:p>
-    <w:p>
-      <w:pPr>
-        <w:rPr>
-          <w:rFonts w:asciiTheme="majorHAnsi" w:hAnsiTheme="majorHAnsi" w:cstheme="majorHAnsi"/>
-          <w:color w:val="4472C4" w:themeColor="accent1"/>
-          <w:sz w:val="40"/>
-          <w:szCs w:val="40"/>
-        </w:rPr>
-      </w:pPr>
+        <w:drawing>
+          <wp:inline distT="0" distB="0" distL="0" distR="0" wp14:anchorId="7FCA175E" wp14:editId="460672E7">
+            <wp:extent cx="5534891" cy="3694269"/>
+            <wp:effectExtent l="0" t="0" r="8890" b="1905"/>
+            <wp:docPr id="622505205" name="Picture 12"/>
+            <wp:cNvGraphicFramePr>
+              <a:graphicFrameLocks xmlns:a="http://schemas.openxmlformats.org/drawingml/2006/main" noChangeAspect="1"/>
+            </wp:cNvGraphicFramePr>
+            <a:graphic xmlns:a="http://schemas.openxmlformats.org/drawingml/2006/main">
+              <a:graphicData uri="http://schemas.openxmlformats.org/drawingml/2006/picture">
+                <pic:pic xmlns:pic="http://schemas.openxmlformats.org/drawingml/2006/picture">
+                  <pic:nvPicPr>
+                    <pic:cNvPr id="0" name="Picture 7"/>
+                    <pic:cNvPicPr>
+                      <a:picLocks noChangeAspect="1" noChangeArrowheads="1"/>
+                    </pic:cNvPicPr>
+                  </pic:nvPicPr>
+                  <pic:blipFill>
+                    <a:blip r:embed="rId11" cstate="print">
+                      <a:extLst>
+                        <a:ext uri="{28A0092B-C50C-407E-A947-70E740481C1C}">
+                          <a14:useLocalDpi xmlns:a14="http://schemas.microsoft.com/office/drawing/2010/main" val="0"/>
+                        </a:ext>
+                      </a:extLst>
+                    </a:blip>
+                    <a:srcRect/>
+                    <a:stretch>
+                      <a:fillRect/>
+                    </a:stretch>
+                  </pic:blipFill>
+                  <pic:spPr bwMode="auto">
+                    <a:xfrm>
+                      <a:off x="0" y="0"/>
+                      <a:ext cx="5553317" cy="3706568"/>
+                    </a:xfrm>
+                    <a:prstGeom prst="rect">
+                      <a:avLst/>
+                    </a:prstGeom>
+                    <a:noFill/>
+                    <a:ln>
+                      <a:noFill/>
+                    </a:ln>
+                  </pic:spPr>
+                </pic:pic>
+              </a:graphicData>
+            </a:graphic>
+          </wp:inline>
+        </w:drawing>
+      </w:r>
     </w:p>
     <w:p>
       <w:pPr>
@@ -3788,25 +3155,7 @@
           <w:sz w:val="40"/>
           <w:szCs w:val="40"/>
         </w:rPr>
-        <w:t xml:space="preserve">After a message </w:t>
-      </w:r>
-      <w:proofErr w:type="gramStart"/>
-      <w:r>
-        <w:rPr>
-          <w:rFonts w:cstheme="minorHAnsi"/>
-          <w:sz w:val="40"/>
-          <w:szCs w:val="40"/>
-        </w:rPr>
-        <w:t>sent</w:t>
-      </w:r>
-      <w:proofErr w:type="gramEnd"/>
-      <w:r>
-        <w:rPr>
-          <w:rFonts w:cstheme="minorHAnsi"/>
-          <w:sz w:val="40"/>
-          <w:szCs w:val="40"/>
-        </w:rPr>
-        <w:t xml:space="preserve"> to the </w:t>
+        <w:t xml:space="preserve">After a message sent to the </w:t>
       </w:r>
       <w:r>
         <w:rPr>
@@ -3926,25 +3275,7 @@
           <w:sz w:val="40"/>
           <w:szCs w:val="40"/>
         </w:rPr>
-        <w:t xml:space="preserve">origin node of the message </w:t>
-      </w:r>
-      <w:proofErr w:type="gramStart"/>
-      <w:r>
-        <w:rPr>
-          <w:rFonts w:cstheme="minorHAnsi"/>
-          <w:sz w:val="40"/>
-          <w:szCs w:val="40"/>
-        </w:rPr>
-        <w:t>received that it</w:t>
-      </w:r>
-      <w:proofErr w:type="gramEnd"/>
-      <w:r>
-        <w:rPr>
-          <w:rFonts w:cstheme="minorHAnsi"/>
-          <w:sz w:val="40"/>
-          <w:szCs w:val="40"/>
-        </w:rPr>
-        <w:t xml:space="preserve"> checks the </w:t>
+        <w:t xml:space="preserve">origin node of the message received that it checks the </w:t>
       </w:r>
       <w:r>
         <w:rPr>
@@ -4048,72 +3379,100 @@
           <w:sz w:val="24"/>
           <w:szCs w:val="24"/>
         </w:rPr>
-        <w:t>&lt;Node chain&gt;: [SOS</w:t>
-      </w:r>
-      <w:proofErr w:type="gramStart"/>
+        <w:t>&lt;Node chain&gt;: [SOS] : &lt;message id&gt; : &lt;timestamp&gt; | &lt;alert&gt; | GPS: &lt;</w:t>
+      </w:r>
+      <w:proofErr w:type="spellStart"/>
       <w:r>
         <w:rPr>
           <w:rFonts w:cstheme="minorHAnsi"/>
           <w:sz w:val="24"/>
           <w:szCs w:val="24"/>
         </w:rPr>
-        <w:t>] :</w:t>
-      </w:r>
-      <w:proofErr w:type="gramEnd"/>
+        <w:t>lat</w:t>
+      </w:r>
+      <w:proofErr w:type="spellEnd"/>
       <w:r>
         <w:rPr>
           <w:rFonts w:cstheme="minorHAnsi"/>
           <w:sz w:val="24"/>
           <w:szCs w:val="24"/>
         </w:rPr>
-        <w:t xml:space="preserve"> &lt;message id</w:t>
-      </w:r>
-      <w:proofErr w:type="gramStart"/>
+        <w:t xml:space="preserve">, </w:t>
+      </w:r>
+      <w:proofErr w:type="spellStart"/>
       <w:r>
         <w:rPr>
           <w:rFonts w:cstheme="minorHAnsi"/>
           <w:sz w:val="24"/>
           <w:szCs w:val="24"/>
         </w:rPr>
-        <w:t>&gt; :</w:t>
-      </w:r>
-      <w:proofErr w:type="gramEnd"/>
+        <w:t>lon</w:t>
+      </w:r>
+      <w:proofErr w:type="spellEnd"/>
       <w:r>
         <w:rPr>
           <w:rFonts w:cstheme="minorHAnsi"/>
           <w:sz w:val="24"/>
           <w:szCs w:val="24"/>
         </w:rPr>
-        <w:t xml:space="preserve"> &lt;timestamp&gt; | &lt;alert&gt; | GPS: &lt;</w:t>
-      </w:r>
-      <w:proofErr w:type="spellStart"/>
-      <w:r>
+        <w:t>&gt;</w:t>
+      </w:r>
+    </w:p>
+    <w:p>
+      <w:pPr>
+        <w:rPr>
+          <w:rFonts w:cstheme="minorHAnsi"/>
+          <w:b/>
+          <w:bCs/>
+          <w:sz w:val="40"/>
+          <w:szCs w:val="40"/>
+        </w:rPr>
+      </w:pPr>
+      <w:r>
+        <w:rPr>
+          <w:rFonts w:cstheme="minorHAnsi"/>
+          <w:b/>
+          <w:bCs/>
+          <w:sz w:val="40"/>
+          <w:szCs w:val="40"/>
+        </w:rPr>
+        <w:t>ACK Message format:</w:t>
+      </w:r>
+    </w:p>
+    <w:p>
+      <w:pPr>
         <w:rPr>
           <w:rFonts w:cstheme="minorHAnsi"/>
           <w:sz w:val="24"/>
           <w:szCs w:val="24"/>
         </w:rPr>
-        <w:t>lat</w:t>
-      </w:r>
-      <w:proofErr w:type="spellEnd"/>
+      </w:pPr>
+      <w:r>
+        <w:rPr>
+          <w:rFonts w:cstheme="minorHAnsi"/>
+          <w:b/>
+          <w:bCs/>
+          <w:sz w:val="40"/>
+          <w:szCs w:val="40"/>
+        </w:rPr>
+        <w:tab/>
+      </w:r>
       <w:r>
         <w:rPr>
           <w:rFonts w:cstheme="minorHAnsi"/>
           <w:sz w:val="24"/>
           <w:szCs w:val="24"/>
         </w:rPr>
-        <w:t xml:space="preserve">, </w:t>
-      </w:r>
-      <w:proofErr w:type="spellStart"/>
+        <w:t>&lt;</w:t>
+      </w:r>
       <w:r>
         <w:rPr>
           <w:rFonts w:cstheme="minorHAnsi"/>
           <w:sz w:val="24"/>
           <w:szCs w:val="24"/>
         </w:rPr>
-        <w:t>lon</w:t>
-      </w:r>
-      <w:proofErr w:type="spellEnd"/>
+        <w:t>Node chain</w:t>
+      </w:r>
       <w:r>
         <w:rPr>
           <w:rFonts w:cstheme="minorHAnsi"/>
@@ -4122,6 +3481,104 @@
         </w:rPr>
         <w:t>&gt;</w:t>
       </w:r>
+      <w:r>
+        <w:rPr>
+          <w:rFonts w:cstheme="minorHAnsi"/>
+          <w:sz w:val="24"/>
+          <w:szCs w:val="24"/>
+        </w:rPr>
+        <w:t>: [ACK] : &lt;a base85 string of the sha256 hash of the current users NIC number with the message number&gt;</w:t>
+      </w:r>
+    </w:p>
+    <w:p>
+      <w:pPr>
+        <w:rPr>
+          <w:rFonts w:cstheme="minorHAnsi"/>
+          <w:sz w:val="40"/>
+          <w:szCs w:val="40"/>
+        </w:rPr>
+      </w:pPr>
+      <w:r>
+        <w:rPr>
+          <w:rFonts w:cstheme="minorHAnsi"/>
+          <w:sz w:val="40"/>
+          <w:szCs w:val="40"/>
+        </w:rPr>
+        <w:t xml:space="preserve">We use the SHA256 </w:t>
+      </w:r>
+      <w:r>
+        <w:rPr>
+          <w:rFonts w:cstheme="minorHAnsi"/>
+          <w:sz w:val="40"/>
+          <w:szCs w:val="40"/>
+        </w:rPr>
+        <w:t>hashing</w:t>
+      </w:r>
+      <w:r>
+        <w:rPr>
+          <w:rFonts w:cstheme="minorHAnsi"/>
+          <w:sz w:val="40"/>
+          <w:szCs w:val="40"/>
+        </w:rPr>
+        <w:t xml:space="preserve"> </w:t>
+      </w:r>
+      <w:r>
+        <w:rPr>
+          <w:rFonts w:cstheme="minorHAnsi"/>
+          <w:sz w:val="40"/>
+          <w:szCs w:val="40"/>
+        </w:rPr>
+        <w:t xml:space="preserve">to secure the NIC and base85 </w:t>
+      </w:r>
+      <w:r>
+        <w:rPr>
+          <w:rFonts w:cstheme="minorHAnsi"/>
+          <w:sz w:val="40"/>
+          <w:szCs w:val="40"/>
+        </w:rPr>
+        <w:t xml:space="preserve">encryption to shorten the </w:t>
+      </w:r>
+      <w:r>
+        <w:rPr>
+          <w:rFonts w:cstheme="minorHAnsi"/>
+          <w:sz w:val="40"/>
+          <w:szCs w:val="40"/>
+        </w:rPr>
+        <w:t>hash.</w:t>
+      </w:r>
+    </w:p>
+    <w:p>
+      <w:pPr>
+        <w:rPr>
+          <w:rFonts w:cstheme="minorHAnsi"/>
+          <w:sz w:val="40"/>
+          <w:szCs w:val="40"/>
+        </w:rPr>
+      </w:pPr>
+      <w:r>
+        <w:rPr>
+          <w:rFonts w:cstheme="minorHAnsi"/>
+          <w:sz w:val="40"/>
+          <w:szCs w:val="40"/>
+        </w:rPr>
+        <w:t xml:space="preserve">Until the ACK message </w:t>
+      </w:r>
+      <w:r>
+        <w:rPr>
+          <w:rFonts w:cstheme="minorHAnsi"/>
+          <w:sz w:val="40"/>
+          <w:szCs w:val="40"/>
+        </w:rPr>
+        <w:t xml:space="preserve">receive the Node continuously send the same message with 5-minute intervals. </w:t>
+      </w:r>
+      <w:r>
+        <w:rPr>
+          <w:rFonts w:cstheme="minorHAnsi"/>
+          <w:sz w:val="40"/>
+          <w:szCs w:val="40"/>
+        </w:rPr>
+        <w:t>After the acknowledgement that retrying stops.</w:t>
+      </w:r>
     </w:p>
     <w:p>
       <w:pPr>
@@ -4141,300 +3598,19 @@
           <w:sz w:val="40"/>
           <w:szCs w:val="40"/>
         </w:rPr>
-        <w:t>ACK Message format:</w:t>
-      </w:r>
-    </w:p>
-    <w:p>
-      <w:pPr>
+        <w:lastRenderedPageBreak/>
+        <w:t xml:space="preserve">This protocol is implemented to ensure </w:t>
+      </w:r>
+      <w:r>
         <w:rPr>
           <w:rFonts w:cstheme="minorHAnsi"/>
           <w:b/>
           <w:bCs/>
-          <w:sz w:val="24"/>
-          <w:szCs w:val="24"/>
-        </w:rPr>
-      </w:pPr>
-      <w:r>
-        <w:rPr>
-          <w:rFonts w:cstheme="minorHAnsi"/>
-          <w:b/>
-          <w:bCs/>
-          <w:sz w:val="40"/>
-          <w:szCs w:val="40"/>
-        </w:rPr>
-        <w:tab/>
-      </w:r>
-      <w:r>
-        <w:rPr>
-          <w:rFonts w:cstheme="minorHAnsi"/>
-          <w:b/>
-          <w:bCs/>
-          <w:sz w:val="24"/>
-          <w:szCs w:val="24"/>
-        </w:rPr>
-        <w:t>Node chain: [ACK</w:t>
-      </w:r>
-      <w:proofErr w:type="gramStart"/>
-      <w:r>
-        <w:rPr>
-          <w:rFonts w:cstheme="minorHAnsi"/>
-          <w:b/>
-          <w:bCs/>
-          <w:sz w:val="24"/>
-          <w:szCs w:val="24"/>
-        </w:rPr>
-        <w:t>] :</w:t>
-      </w:r>
-      <w:proofErr w:type="gramEnd"/>
-      <w:r>
-        <w:rPr>
-          <w:rFonts w:cstheme="minorHAnsi"/>
-          <w:b/>
-          <w:bCs/>
-          <w:sz w:val="24"/>
-          <w:szCs w:val="24"/>
-        </w:rPr>
-        <w:t xml:space="preserve"> &lt;a base85 string of the sha256 hash of the current users NIC number with the message number&gt;</w:t>
-      </w:r>
-    </w:p>
-    <w:p>
-      <w:pPr>
-        <w:rPr>
-          <w:rFonts w:cstheme="minorHAnsi"/>
-          <w:sz w:val="40"/>
-          <w:szCs w:val="40"/>
-        </w:rPr>
-      </w:pPr>
-      <w:r>
-        <w:rPr>
-          <w:rFonts w:cstheme="minorHAnsi"/>
-          <w:sz w:val="40"/>
-          <w:szCs w:val="40"/>
-        </w:rPr>
-        <w:t xml:space="preserve">We use the SHA256 </w:t>
-      </w:r>
-      <w:r>
-        <w:rPr>
-          <w:rFonts w:cstheme="minorHAnsi"/>
-          <w:sz w:val="40"/>
-          <w:szCs w:val="40"/>
-        </w:rPr>
-        <w:t>hashing</w:t>
-      </w:r>
-      <w:r>
-        <w:rPr>
-          <w:rFonts w:cstheme="minorHAnsi"/>
-          <w:sz w:val="40"/>
-          <w:szCs w:val="40"/>
-        </w:rPr>
-        <w:t xml:space="preserve"> </w:t>
-      </w:r>
-      <w:r>
-        <w:rPr>
-          <w:rFonts w:cstheme="minorHAnsi"/>
-          <w:sz w:val="40"/>
-          <w:szCs w:val="40"/>
-        </w:rPr>
-        <w:t xml:space="preserve">to secure the NIC and base85 </w:t>
-      </w:r>
-      <w:r>
-        <w:rPr>
-          <w:rFonts w:cstheme="minorHAnsi"/>
-          <w:sz w:val="40"/>
-          <w:szCs w:val="40"/>
-        </w:rPr>
-        <w:t xml:space="preserve">encryption to shorten the </w:t>
-      </w:r>
-      <w:r>
-        <w:rPr>
-          <w:rFonts w:cstheme="minorHAnsi"/>
-          <w:sz w:val="40"/>
-          <w:szCs w:val="40"/>
-        </w:rPr>
-        <w:t>hash.</w:t>
-      </w:r>
-    </w:p>
-    <w:p>
-      <w:pPr>
-        <w:rPr>
-          <w:rFonts w:cstheme="minorHAnsi"/>
-          <w:sz w:val="40"/>
-          <w:szCs w:val="40"/>
-        </w:rPr>
-      </w:pPr>
-      <w:r>
-        <w:rPr>
-          <w:rFonts w:cstheme="minorHAnsi"/>
-          <w:sz w:val="40"/>
-          <w:szCs w:val="40"/>
-        </w:rPr>
-        <w:t xml:space="preserve">Until the ACK message </w:t>
-      </w:r>
-      <w:r>
-        <w:rPr>
-          <w:rFonts w:cstheme="minorHAnsi"/>
-          <w:sz w:val="40"/>
-          <w:szCs w:val="40"/>
-        </w:rPr>
-        <w:t xml:space="preserve">receive the Node continuously send the same message with 5-minute intervals. </w:t>
-      </w:r>
-      <w:r>
-        <w:rPr>
-          <w:rFonts w:cstheme="minorHAnsi"/>
-          <w:sz w:val="40"/>
-          <w:szCs w:val="40"/>
-        </w:rPr>
-        <w:t>After the acknowledgement that retrying stops.</w:t>
-      </w:r>
-    </w:p>
-    <w:p>
-      <w:pPr>
-        <w:rPr>
-          <w:rFonts w:cstheme="minorHAnsi"/>
-          <w:b/>
-          <w:bCs/>
-          <w:sz w:val="40"/>
-          <w:szCs w:val="40"/>
-        </w:rPr>
-      </w:pPr>
-      <w:r>
-        <w:rPr>
-          <w:rFonts w:cstheme="minorHAnsi"/>
-          <w:b/>
-          <w:bCs/>
-          <w:sz w:val="40"/>
-          <w:szCs w:val="40"/>
-        </w:rPr>
-        <w:lastRenderedPageBreak/>
-        <w:t xml:space="preserve">This protocol is implemented to ensure </w:t>
-      </w:r>
-      <w:r>
-        <w:rPr>
-          <w:rFonts w:cstheme="minorHAnsi"/>
-          <w:b/>
-          <w:bCs/>
           <w:sz w:val="40"/>
           <w:szCs w:val="40"/>
         </w:rPr>
         <w:t>the data reached destination safely.</w:t>
       </w:r>
-    </w:p>
-    <w:p>
-      <w:pPr>
-        <w:rPr>
-          <w:rFonts w:cstheme="minorHAnsi"/>
-          <w:sz w:val="40"/>
-          <w:szCs w:val="40"/>
-        </w:rPr>
-      </w:pPr>
-    </w:p>
-    <w:p>
-      <w:pPr>
-        <w:rPr>
-          <w:rFonts w:asciiTheme="majorHAnsi" w:hAnsiTheme="majorHAnsi" w:cstheme="majorHAnsi"/>
-          <w:sz w:val="40"/>
-          <w:szCs w:val="40"/>
-        </w:rPr>
-      </w:pPr>
-    </w:p>
-    <w:p>
-      <w:pPr>
-        <w:rPr>
-          <w:rFonts w:asciiTheme="majorHAnsi" w:hAnsiTheme="majorHAnsi" w:cstheme="majorHAnsi"/>
-          <w:sz w:val="40"/>
-          <w:szCs w:val="40"/>
-        </w:rPr>
-      </w:pPr>
-    </w:p>
-    <w:p>
-      <w:pPr>
-        <w:rPr>
-          <w:rFonts w:asciiTheme="majorHAnsi" w:hAnsiTheme="majorHAnsi" w:cstheme="majorHAnsi"/>
-          <w:sz w:val="40"/>
-          <w:szCs w:val="40"/>
-        </w:rPr>
-      </w:pPr>
-    </w:p>
-    <w:p>
-      <w:pPr>
-        <w:rPr>
-          <w:rFonts w:asciiTheme="majorHAnsi" w:hAnsiTheme="majorHAnsi" w:cstheme="majorHAnsi"/>
-          <w:sz w:val="40"/>
-          <w:szCs w:val="40"/>
-        </w:rPr>
-      </w:pPr>
-    </w:p>
-    <w:p>
-      <w:pPr>
-        <w:rPr>
-          <w:rFonts w:asciiTheme="majorHAnsi" w:hAnsiTheme="majorHAnsi" w:cstheme="majorHAnsi"/>
-          <w:sz w:val="40"/>
-          <w:szCs w:val="40"/>
-        </w:rPr>
-      </w:pPr>
-    </w:p>
-    <w:p>
-      <w:pPr>
-        <w:rPr>
-          <w:rFonts w:asciiTheme="majorHAnsi" w:hAnsiTheme="majorHAnsi" w:cstheme="majorHAnsi"/>
-          <w:sz w:val="40"/>
-          <w:szCs w:val="40"/>
-        </w:rPr>
-      </w:pPr>
-    </w:p>
-    <w:p>
-      <w:pPr>
-        <w:rPr>
-          <w:rFonts w:asciiTheme="majorHAnsi" w:hAnsiTheme="majorHAnsi" w:cstheme="majorHAnsi"/>
-          <w:sz w:val="40"/>
-          <w:szCs w:val="40"/>
-        </w:rPr>
-      </w:pPr>
-    </w:p>
-    <w:p>
-      <w:pPr>
-        <w:rPr>
-          <w:rFonts w:asciiTheme="majorHAnsi" w:hAnsiTheme="majorHAnsi" w:cstheme="majorHAnsi"/>
-          <w:sz w:val="40"/>
-          <w:szCs w:val="40"/>
-        </w:rPr>
-      </w:pPr>
-    </w:p>
-    <w:p>
-      <w:pPr>
-        <w:rPr>
-          <w:rFonts w:asciiTheme="majorHAnsi" w:hAnsiTheme="majorHAnsi" w:cstheme="majorHAnsi"/>
-          <w:sz w:val="40"/>
-          <w:szCs w:val="40"/>
-        </w:rPr>
-      </w:pPr>
-    </w:p>
-    <w:p>
-      <w:pPr>
-        <w:rPr>
-          <w:rFonts w:asciiTheme="majorHAnsi" w:hAnsiTheme="majorHAnsi" w:cstheme="majorHAnsi"/>
-          <w:sz w:val="40"/>
-          <w:szCs w:val="40"/>
-        </w:rPr>
-      </w:pPr>
-    </w:p>
-    <w:p>
-      <w:pPr>
-        <w:rPr>
-          <w:rFonts w:asciiTheme="majorHAnsi" w:hAnsiTheme="majorHAnsi" w:cstheme="majorHAnsi"/>
-          <w:sz w:val="40"/>
-          <w:szCs w:val="40"/>
-        </w:rPr>
-      </w:pPr>
-    </w:p>
-    <w:p>
-      <w:pPr>
-        <w:rPr>
-          <w:rFonts w:asciiTheme="majorHAnsi" w:hAnsiTheme="majorHAnsi" w:cstheme="majorHAnsi"/>
-          <w:sz w:val="40"/>
-          <w:szCs w:val="40"/>
-        </w:rPr>
-      </w:pPr>
     </w:p>
     <w:p>
       <w:pPr>
@@ -4474,7 +3650,6 @@
           <w:sz w:val="72"/>
           <w:szCs w:val="72"/>
         </w:rPr>
-        <w:lastRenderedPageBreak/>
         <w:t>User guide</w:t>
       </w:r>
       <w:r>
@@ -4517,23 +3692,13 @@
           <w:szCs w:val="40"/>
         </w:rPr>
       </w:pPr>
-      <w:proofErr w:type="gramStart"/>
-      <w:r>
-        <w:rPr>
-          <w:rFonts w:cstheme="minorHAnsi"/>
-          <w:sz w:val="40"/>
-          <w:szCs w:val="40"/>
-        </w:rPr>
-        <w:t>User</w:t>
-      </w:r>
-      <w:proofErr w:type="gramEnd"/>
-      <w:r>
-        <w:rPr>
-          <w:rFonts w:cstheme="minorHAnsi"/>
-          <w:sz w:val="40"/>
-          <w:szCs w:val="40"/>
-        </w:rPr>
-        <w:t xml:space="preserve"> should have the </w:t>
+      <w:r>
+        <w:rPr>
+          <w:rFonts w:cstheme="minorHAnsi"/>
+          <w:sz w:val="40"/>
+          <w:szCs w:val="40"/>
+        </w:rPr>
+        <w:t xml:space="preserve">User should have the </w:t>
       </w:r>
       <w:proofErr w:type="spellStart"/>
       <w:r>
@@ -4551,25 +3716,7 @@
           <w:sz w:val="40"/>
           <w:szCs w:val="40"/>
         </w:rPr>
-        <w:t xml:space="preserve"> application </w:t>
-      </w:r>
-      <w:proofErr w:type="gramStart"/>
-      <w:r>
-        <w:rPr>
-          <w:rFonts w:cstheme="minorHAnsi"/>
-          <w:sz w:val="40"/>
-          <w:szCs w:val="40"/>
-        </w:rPr>
-        <w:t>in</w:t>
-      </w:r>
-      <w:proofErr w:type="gramEnd"/>
-      <w:r>
-        <w:rPr>
-          <w:rFonts w:cstheme="minorHAnsi"/>
-          <w:sz w:val="40"/>
-          <w:szCs w:val="40"/>
-        </w:rPr>
-        <w:t xml:space="preserve"> their mobile phone</w:t>
+        <w:t xml:space="preserve"> application in their mobile phone</w:t>
       </w:r>
     </w:p>
     <w:p>
@@ -4693,43 +3840,7 @@
           <w:sz w:val="40"/>
           <w:szCs w:val="40"/>
         </w:rPr>
-        <w:t xml:space="preserve"> try to click </w:t>
-      </w:r>
-      <w:proofErr w:type="gramStart"/>
-      <w:r>
-        <w:rPr>
-          <w:rFonts w:cstheme="minorHAnsi"/>
-          <w:sz w:val="40"/>
-          <w:szCs w:val="40"/>
-        </w:rPr>
-        <w:t>more and more</w:t>
-      </w:r>
-      <w:proofErr w:type="gramEnd"/>
-      <w:r>
-        <w:rPr>
-          <w:rFonts w:cstheme="minorHAnsi"/>
-          <w:sz w:val="40"/>
-          <w:szCs w:val="40"/>
-        </w:rPr>
-        <w:t xml:space="preserve"> times if the notification did not </w:t>
-      </w:r>
-      <w:proofErr w:type="gramStart"/>
-      <w:r>
-        <w:rPr>
-          <w:rFonts w:cstheme="minorHAnsi"/>
-          <w:sz w:val="40"/>
-          <w:szCs w:val="40"/>
-        </w:rPr>
-        <w:t>came</w:t>
-      </w:r>
-      <w:proofErr w:type="gramEnd"/>
-      <w:r>
-        <w:rPr>
-          <w:rFonts w:cstheme="minorHAnsi"/>
-          <w:sz w:val="40"/>
-          <w:szCs w:val="40"/>
-        </w:rPr>
-        <w:t>. The device will repeat your message until a valid response.</w:t>
+        <w:t xml:space="preserve"> try to click more and more times if the notification did not came. The device will repeat your message until a valid response.</w:t>
       </w:r>
     </w:p>
     <w:p>
@@ -4744,7 +3855,6 @@
     </w:p>
     <w:p>
       <w:pPr>
-        <w:jc w:val="right"/>
         <w:rPr>
           <w:rFonts w:asciiTheme="majorHAnsi" w:hAnsiTheme="majorHAnsi" w:cstheme="majorHAnsi"/>
           <w:sz w:val="52"/>
@@ -4754,37 +3864,953 @@
     </w:p>
     <w:p>
       <w:pPr>
-        <w:jc w:val="right"/>
-        <w:rPr>
-          <w:rFonts w:asciiTheme="majorHAnsi" w:hAnsiTheme="majorHAnsi" w:cstheme="majorHAnsi"/>
+        <w:pStyle w:val="ListParagraph"/>
+        <w:numPr>
+          <w:ilvl w:val="0"/>
+          <w:numId w:val="8"/>
+        </w:numPr>
+        <w:rPr>
+          <w:rFonts w:asciiTheme="majorHAnsi" w:hAnsiTheme="majorHAnsi" w:cstheme="majorHAnsi"/>
+          <w:b/>
+          <w:bCs/>
+          <w:i/>
+          <w:iCs/>
+          <w:color w:val="4472C4" w:themeColor="accent1"/>
+          <w:sz w:val="72"/>
+          <w:szCs w:val="72"/>
+        </w:rPr>
+      </w:pPr>
+      <w:r>
+        <w:rPr>
+          <w:rFonts w:asciiTheme="majorHAnsi" w:hAnsiTheme="majorHAnsi" w:cstheme="majorHAnsi"/>
+          <w:b/>
+          <w:bCs/>
+          <w:i/>
+          <w:iCs/>
+          <w:color w:val="4472C4" w:themeColor="accent1"/>
+          <w:sz w:val="72"/>
+          <w:szCs w:val="72"/>
+        </w:rPr>
+        <w:lastRenderedPageBreak/>
+        <w:t>Conclusion and Future work</w:t>
+      </w:r>
+    </w:p>
+    <w:p>
+      <w:pPr>
+        <w:rPr>
+          <w:rFonts w:asciiTheme="majorHAnsi" w:hAnsiTheme="majorHAnsi" w:cstheme="majorHAnsi"/>
+          <w:color w:val="4472C4" w:themeColor="accent1"/>
           <w:sz w:val="52"/>
           <w:szCs w:val="52"/>
         </w:rPr>
       </w:pPr>
-    </w:p>
-    <w:p>
-      <w:pPr>
-        <w:jc w:val="right"/>
-        <w:rPr>
-          <w:rFonts w:asciiTheme="majorHAnsi" w:hAnsiTheme="majorHAnsi" w:cstheme="majorHAnsi"/>
+      <w:r>
+        <w:rPr>
+          <w:rFonts w:asciiTheme="majorHAnsi" w:hAnsiTheme="majorHAnsi" w:cstheme="majorHAnsi"/>
+          <w:color w:val="4472C4" w:themeColor="accent1"/>
           <w:sz w:val="52"/>
           <w:szCs w:val="52"/>
         </w:rPr>
-      </w:pPr>
-    </w:p>
-    <w:p>
-      <w:pPr>
-        <w:spacing w:line="240" w:lineRule="auto"/>
-        <w:jc w:val="right"/>
-        <w:rPr>
-          <w:rFonts w:asciiTheme="majorHAnsi" w:hAnsiTheme="majorHAnsi" w:cstheme="majorHAnsi"/>
+        <w:t>Conclusion</w:t>
+      </w:r>
+    </w:p>
+    <w:p>
+      <w:pPr>
+        <w:rPr>
+          <w:rFonts w:cstheme="minorHAnsi"/>
+          <w:sz w:val="40"/>
+          <w:szCs w:val="40"/>
+        </w:rPr>
+      </w:pPr>
+      <w:r>
+        <w:rPr>
+          <w:rFonts w:cstheme="minorHAnsi"/>
+          <w:sz w:val="40"/>
+          <w:szCs w:val="40"/>
+        </w:rPr>
+        <w:t>Through this project we</w:t>
+      </w:r>
+      <w:r>
+        <w:rPr>
+          <w:rFonts w:cstheme="minorHAnsi"/>
+          <w:sz w:val="40"/>
+          <w:szCs w:val="40"/>
+        </w:rPr>
+        <w:t xml:space="preserve"> defined a low-cost, off-grid disaster communication mesh concept</w:t>
+      </w:r>
+      <w:r>
+        <w:rPr>
+          <w:rFonts w:cstheme="minorHAnsi"/>
+          <w:sz w:val="40"/>
+          <w:szCs w:val="40"/>
+        </w:rPr>
+        <w:t xml:space="preserve"> </w:t>
+      </w:r>
+      <w:r>
+        <w:rPr>
+          <w:rFonts w:cstheme="minorHAnsi"/>
+          <w:sz w:val="40"/>
+          <w:szCs w:val="40"/>
+        </w:rPr>
+        <w:t>based on locally powered radio nodes, short text messages, and store-and-forward relaying. It</w:t>
+      </w:r>
+      <w:r>
+        <w:rPr>
+          <w:rFonts w:cstheme="minorHAnsi"/>
+          <w:sz w:val="40"/>
+          <w:szCs w:val="40"/>
+        </w:rPr>
+        <w:t xml:space="preserve"> </w:t>
+      </w:r>
+      <w:r>
+        <w:rPr>
+          <w:rFonts w:cstheme="minorHAnsi"/>
+          <w:sz w:val="40"/>
+          <w:szCs w:val="40"/>
+        </w:rPr>
+        <w:t>establishes a requirements-driven architecture, outlines hardware and firmware</w:t>
+      </w:r>
+      <w:r>
+        <w:rPr>
+          <w:rFonts w:cstheme="minorHAnsi"/>
+          <w:sz w:val="40"/>
+          <w:szCs w:val="40"/>
+        </w:rPr>
+        <w:t xml:space="preserve"> </w:t>
+      </w:r>
+      <w:r>
+        <w:rPr>
+          <w:rFonts w:cstheme="minorHAnsi"/>
+          <w:sz w:val="40"/>
+          <w:szCs w:val="40"/>
+        </w:rPr>
+        <w:t>responsibilities, and proposes a verification plan covering functional behavior, multi-hop</w:t>
+      </w:r>
+      <w:r>
+        <w:rPr>
+          <w:rFonts w:cstheme="minorHAnsi"/>
+          <w:sz w:val="40"/>
+          <w:szCs w:val="40"/>
+        </w:rPr>
+        <w:t xml:space="preserve"> </w:t>
+      </w:r>
+      <w:r>
+        <w:rPr>
+          <w:rFonts w:cstheme="minorHAnsi"/>
+          <w:sz w:val="40"/>
+          <w:szCs w:val="40"/>
+        </w:rPr>
+        <w:t>delivery, latency, range, power consumption, and recovery after link failure.</w:t>
+      </w:r>
+    </w:p>
+    <w:p>
+      <w:pPr>
+        <w:rPr>
+          <w:rFonts w:asciiTheme="majorHAnsi" w:hAnsiTheme="majorHAnsi" w:cstheme="majorHAnsi"/>
+          <w:color w:val="4472C4" w:themeColor="accent1"/>
           <w:sz w:val="52"/>
           <w:szCs w:val="52"/>
         </w:rPr>
       </w:pPr>
+      <w:r>
+        <w:rPr>
+          <w:rFonts w:asciiTheme="majorHAnsi" w:hAnsiTheme="majorHAnsi" w:cstheme="majorHAnsi"/>
+          <w:color w:val="4472C4" w:themeColor="accent1"/>
+          <w:sz w:val="52"/>
+          <w:szCs w:val="52"/>
+        </w:rPr>
+        <w:t>Future work</w:t>
+      </w:r>
+    </w:p>
+    <w:p>
+      <w:pPr>
+        <w:pStyle w:val="ListParagraph"/>
+        <w:numPr>
+          <w:ilvl w:val="0"/>
+          <w:numId w:val="13"/>
+        </w:numPr>
+        <w:rPr>
+          <w:rFonts w:cstheme="minorHAnsi"/>
+          <w:sz w:val="40"/>
+          <w:szCs w:val="40"/>
+        </w:rPr>
+      </w:pPr>
+      <w:r>
+        <w:rPr>
+          <w:rFonts w:cstheme="minorHAnsi"/>
+          <w:sz w:val="40"/>
+          <w:szCs w:val="40"/>
+        </w:rPr>
+        <w:t xml:space="preserve">Build and test </w:t>
+      </w:r>
+      <w:r>
+        <w:rPr>
+          <w:rFonts w:cstheme="minorHAnsi"/>
+          <w:sz w:val="40"/>
+          <w:szCs w:val="40"/>
+        </w:rPr>
+        <w:t>at least 5 nodes to demonstrate a genuine multi-hop delivery.</w:t>
+      </w:r>
+    </w:p>
+    <w:p>
+      <w:pPr>
+        <w:pStyle w:val="ListParagraph"/>
+        <w:numPr>
+          <w:ilvl w:val="0"/>
+          <w:numId w:val="13"/>
+        </w:numPr>
+        <w:rPr>
+          <w:rFonts w:cstheme="minorHAnsi"/>
+          <w:sz w:val="40"/>
+          <w:szCs w:val="40"/>
+        </w:rPr>
+      </w:pPr>
+      <w:r>
+        <w:rPr>
+          <w:rFonts w:cstheme="minorHAnsi"/>
+          <w:sz w:val="40"/>
+          <w:szCs w:val="40"/>
+        </w:rPr>
+        <w:t xml:space="preserve">Add a rechargeable LiPo battery and design a </w:t>
+      </w:r>
+      <w:r>
+        <w:rPr>
+          <w:rFonts w:cstheme="minorHAnsi"/>
+          <w:sz w:val="40"/>
+          <w:szCs w:val="40"/>
+        </w:rPr>
+        <w:t>cover for field nodes for improve durability and portability.</w:t>
+      </w:r>
+    </w:p>
+    <w:p>
+      <w:pPr>
+        <w:pStyle w:val="ListParagraph"/>
+        <w:numPr>
+          <w:ilvl w:val="0"/>
+          <w:numId w:val="13"/>
+        </w:numPr>
+        <w:rPr>
+          <w:rFonts w:cstheme="minorHAnsi"/>
+          <w:sz w:val="40"/>
+          <w:szCs w:val="40"/>
+        </w:rPr>
+      </w:pPr>
+      <w:r>
+        <w:rPr>
+          <w:rFonts w:cstheme="minorHAnsi"/>
+          <w:sz w:val="40"/>
+          <w:szCs w:val="40"/>
+        </w:rPr>
+        <w:t>Implement a user authentication system and payload encryption with a documented key-management process.</w:t>
+      </w:r>
+    </w:p>
+    <w:p>
+      <w:pPr>
+        <w:pStyle w:val="ListParagraph"/>
+        <w:numPr>
+          <w:ilvl w:val="0"/>
+          <w:numId w:val="13"/>
+        </w:numPr>
+        <w:rPr>
+          <w:rFonts w:cstheme="minorHAnsi"/>
+          <w:sz w:val="40"/>
+          <w:szCs w:val="40"/>
+        </w:rPr>
+      </w:pPr>
+      <w:r>
+        <w:rPr>
+          <w:rFonts w:cstheme="minorHAnsi"/>
+          <w:sz w:val="40"/>
+          <w:szCs w:val="40"/>
+        </w:rPr>
+        <w:lastRenderedPageBreak/>
+        <w:t>Evaluate controlled flooding against a routing approach under increasing traffic load.</w:t>
+      </w:r>
+    </w:p>
+    <w:p>
+      <w:pPr>
+        <w:pStyle w:val="ListParagraph"/>
+        <w:numPr>
+          <w:ilvl w:val="0"/>
+          <w:numId w:val="13"/>
+        </w:numPr>
+        <w:rPr>
+          <w:rFonts w:cstheme="minorHAnsi"/>
+          <w:sz w:val="40"/>
+          <w:szCs w:val="40"/>
+        </w:rPr>
+      </w:pPr>
+      <w:r>
+        <w:rPr>
+          <w:rFonts w:cstheme="minorHAnsi"/>
+          <w:sz w:val="40"/>
+          <w:szCs w:val="40"/>
+        </w:rPr>
+        <w:t>Add accessible UI features such as high-contrast status, clear acknowledgement states,</w:t>
+      </w:r>
+      <w:r>
+        <w:rPr>
+          <w:rFonts w:cstheme="minorHAnsi"/>
+          <w:sz w:val="40"/>
+          <w:szCs w:val="40"/>
+        </w:rPr>
+        <w:t xml:space="preserve"> </w:t>
+      </w:r>
+      <w:r>
+        <w:rPr>
+          <w:rFonts w:cstheme="minorHAnsi"/>
+          <w:sz w:val="40"/>
+          <w:szCs w:val="40"/>
+        </w:rPr>
+        <w:t>vibration alerts, and local-language labels.</w:t>
+      </w:r>
+    </w:p>
+    <w:p>
+      <w:pPr>
+        <w:pStyle w:val="ListParagraph"/>
+        <w:numPr>
+          <w:ilvl w:val="0"/>
+          <w:numId w:val="13"/>
+        </w:numPr>
+        <w:rPr>
+          <w:rFonts w:cstheme="minorHAnsi"/>
+          <w:sz w:val="40"/>
+          <w:szCs w:val="40"/>
+        </w:rPr>
+      </w:pPr>
+      <w:r>
+        <w:rPr>
+          <w:rFonts w:cstheme="minorHAnsi"/>
+          <w:sz w:val="40"/>
+          <w:szCs w:val="40"/>
+        </w:rPr>
+        <w:t>Conduct user exercises with emergency-response stakeholders and document the limits of</w:t>
+      </w:r>
+      <w:r>
+        <w:rPr>
+          <w:rFonts w:cstheme="minorHAnsi"/>
+          <w:sz w:val="40"/>
+          <w:szCs w:val="40"/>
+        </w:rPr>
+        <w:t xml:space="preserve"> </w:t>
+      </w:r>
+      <w:r>
+        <w:rPr>
+          <w:rFonts w:cstheme="minorHAnsi"/>
+          <w:sz w:val="40"/>
+          <w:szCs w:val="40"/>
+        </w:rPr>
+        <w:t>the prototype.</w:t>
+      </w:r>
+    </w:p>
+    <w:p>
+      <w:pPr>
+        <w:pStyle w:val="ListParagraph"/>
+        <w:numPr>
+          <w:ilvl w:val="0"/>
+          <w:numId w:val="8"/>
+        </w:numPr>
+        <w:rPr>
+          <w:rFonts w:asciiTheme="majorHAnsi" w:hAnsiTheme="majorHAnsi" w:cstheme="majorHAnsi"/>
+          <w:b/>
+          <w:bCs/>
+          <w:i/>
+          <w:iCs/>
+          <w:color w:val="4472C4" w:themeColor="accent1"/>
+          <w:sz w:val="72"/>
+          <w:szCs w:val="72"/>
+        </w:rPr>
+      </w:pPr>
+      <w:r>
+        <w:rPr>
+          <w:rFonts w:asciiTheme="majorHAnsi" w:hAnsiTheme="majorHAnsi" w:cstheme="majorHAnsi"/>
+          <w:b/>
+          <w:bCs/>
+          <w:i/>
+          <w:iCs/>
+          <w:color w:val="4472C4" w:themeColor="accent1"/>
+          <w:sz w:val="72"/>
+          <w:szCs w:val="72"/>
+        </w:rPr>
+        <w:t>Deployment readiness and statement</w:t>
+      </w:r>
+    </w:p>
+    <w:p>
+      <w:pPr>
+        <w:jc w:val="both"/>
+        <w:rPr>
+          <w:rFonts w:asciiTheme="majorHAnsi" w:hAnsiTheme="majorHAnsi" w:cstheme="majorHAnsi"/>
+          <w:sz w:val="32"/>
+          <w:szCs w:val="32"/>
+        </w:rPr>
+      </w:pPr>
+      <w:r>
+        <w:rPr>
+          <w:rFonts w:asciiTheme="majorHAnsi" w:hAnsiTheme="majorHAnsi" w:cstheme="majorHAnsi"/>
+          <w:sz w:val="32"/>
+          <w:szCs w:val="32"/>
+        </w:rPr>
+        <w:t>A student prototype should not be described as disaster-ready solely because messages</w:t>
+      </w:r>
+      <w:r>
+        <w:rPr>
+          <w:rFonts w:asciiTheme="majorHAnsi" w:hAnsiTheme="majorHAnsi" w:cstheme="majorHAnsi"/>
+          <w:sz w:val="32"/>
+          <w:szCs w:val="32"/>
+        </w:rPr>
+        <w:t xml:space="preserve"> </w:t>
+      </w:r>
+      <w:r>
+        <w:rPr>
+          <w:rFonts w:asciiTheme="majorHAnsi" w:hAnsiTheme="majorHAnsi" w:cstheme="majorHAnsi"/>
+          <w:sz w:val="32"/>
+          <w:szCs w:val="32"/>
+        </w:rPr>
+        <w:t>pass between two boards. Before any real emergency deployment, it would require</w:t>
+      </w:r>
+      <w:r>
+        <w:rPr>
+          <w:rFonts w:asciiTheme="majorHAnsi" w:hAnsiTheme="majorHAnsi" w:cstheme="majorHAnsi"/>
+          <w:sz w:val="32"/>
+          <w:szCs w:val="32"/>
+        </w:rPr>
+        <w:t xml:space="preserve"> </w:t>
+      </w:r>
+      <w:r>
+        <w:rPr>
+          <w:rFonts w:asciiTheme="majorHAnsi" w:hAnsiTheme="majorHAnsi" w:cstheme="majorHAnsi"/>
+          <w:sz w:val="32"/>
+          <w:szCs w:val="32"/>
+        </w:rPr>
+        <w:t>radio-regulatory review, security review, robust enclosure and power testing, documented</w:t>
+      </w:r>
+      <w:r>
+        <w:rPr>
+          <w:rFonts w:asciiTheme="majorHAnsi" w:hAnsiTheme="majorHAnsi" w:cstheme="majorHAnsi"/>
+          <w:sz w:val="32"/>
+          <w:szCs w:val="32"/>
+        </w:rPr>
+        <w:t xml:space="preserve"> </w:t>
+      </w:r>
+      <w:r>
+        <w:rPr>
+          <w:rFonts w:asciiTheme="majorHAnsi" w:hAnsiTheme="majorHAnsi" w:cstheme="majorHAnsi"/>
+          <w:sz w:val="32"/>
+          <w:szCs w:val="32"/>
+        </w:rPr>
+        <w:t>operating procedures, representative field exercises, and independent validation. It should</w:t>
+      </w:r>
+      <w:r>
+        <w:rPr>
+          <w:rFonts w:asciiTheme="majorHAnsi" w:hAnsiTheme="majorHAnsi" w:cstheme="majorHAnsi"/>
+          <w:sz w:val="32"/>
+          <w:szCs w:val="32"/>
+        </w:rPr>
+        <w:t xml:space="preserve"> </w:t>
+      </w:r>
+      <w:r>
+        <w:rPr>
+          <w:rFonts w:asciiTheme="majorHAnsi" w:hAnsiTheme="majorHAnsi" w:cstheme="majorHAnsi"/>
+          <w:sz w:val="32"/>
+          <w:szCs w:val="32"/>
+        </w:rPr>
+        <w:t>remain supplementary to established emergency communication systems.</w:t>
+      </w:r>
+    </w:p>
+    <w:p>
+      <w:pPr>
+        <w:rPr>
+          <w:rFonts w:asciiTheme="majorHAnsi" w:hAnsiTheme="majorHAnsi" w:cstheme="majorHAnsi"/>
+          <w:sz w:val="52"/>
+          <w:szCs w:val="52"/>
+        </w:rPr>
+      </w:pPr>
+    </w:p>
+    <w:p>
+      <w:pPr>
+        <w:rPr>
+          <w:rFonts w:asciiTheme="majorHAnsi" w:hAnsiTheme="majorHAnsi" w:cstheme="majorHAnsi"/>
+          <w:sz w:val="52"/>
+          <w:szCs w:val="52"/>
+        </w:rPr>
+      </w:pPr>
+    </w:p>
+    <w:p>
+      <w:pPr>
+        <w:pStyle w:val="ListParagraph"/>
+        <w:numPr>
+          <w:ilvl w:val="0"/>
+          <w:numId w:val="8"/>
+        </w:numPr>
+        <w:spacing w:line="240" w:lineRule="auto"/>
+        <w:rPr>
+          <w:rFonts w:asciiTheme="majorHAnsi" w:hAnsiTheme="majorHAnsi" w:cstheme="majorHAnsi"/>
+          <w:b/>
+          <w:bCs/>
+          <w:i/>
+          <w:iCs/>
+          <w:color w:val="4472C4" w:themeColor="accent1"/>
+          <w:sz w:val="72"/>
+          <w:szCs w:val="72"/>
+        </w:rPr>
+      </w:pPr>
+      <w:r>
+        <w:rPr>
+          <w:rFonts w:asciiTheme="majorHAnsi" w:hAnsiTheme="majorHAnsi" w:cstheme="majorHAnsi"/>
+          <w:b/>
+          <w:bCs/>
+          <w:i/>
+          <w:iCs/>
+          <w:color w:val="4472C4" w:themeColor="accent1"/>
+          <w:sz w:val="72"/>
+          <w:szCs w:val="72"/>
+        </w:rPr>
+        <w:lastRenderedPageBreak/>
+        <w:t>Appendix</w:t>
+      </w:r>
+    </w:p>
+    <w:p>
+      <w:pPr>
+        <w:spacing w:line="240" w:lineRule="auto"/>
+        <w:rPr>
+          <w:rFonts w:asciiTheme="majorHAnsi" w:hAnsiTheme="majorHAnsi" w:cstheme="majorHAnsi"/>
+          <w:i/>
+          <w:iCs/>
+          <w:sz w:val="40"/>
+          <w:szCs w:val="40"/>
+        </w:rPr>
+      </w:pPr>
+      <w:r>
+        <w:rPr>
+          <w:rFonts w:asciiTheme="majorHAnsi" w:hAnsiTheme="majorHAnsi" w:cstheme="majorHAnsi"/>
+          <w:i/>
+          <w:iCs/>
+          <w:sz w:val="40"/>
+          <w:szCs w:val="40"/>
+        </w:rPr>
+        <w:t>Early stages of our project</w:t>
+      </w:r>
+    </w:p>
+    <w:p>
+      <w:pPr>
+        <w:spacing w:line="240" w:lineRule="auto"/>
+        <w:rPr>
+          <w:rFonts w:asciiTheme="majorHAnsi" w:hAnsiTheme="majorHAnsi" w:cstheme="majorHAnsi"/>
+          <w:noProof/>
+          <w:color w:val="4472C4" w:themeColor="accent1"/>
+          <w:sz w:val="40"/>
+          <w:szCs w:val="40"/>
+        </w:rPr>
+      </w:pPr>
+      <w:r>
+        <w:rPr>
+          <w:rFonts w:asciiTheme="majorHAnsi" w:hAnsiTheme="majorHAnsi" w:cstheme="majorHAnsi"/>
+          <w:noProof/>
+          <w:color w:val="4472C4" w:themeColor="accent1"/>
+          <w:sz w:val="40"/>
+          <w:szCs w:val="40"/>
+        </w:rPr>
+        <w:drawing>
+          <wp:inline distT="0" distB="0" distL="0" distR="0" wp14:anchorId="0054E4D6" wp14:editId="45FF7832">
+            <wp:extent cx="3710375" cy="2784764"/>
+            <wp:effectExtent l="0" t="0" r="4445" b="0"/>
+            <wp:docPr id="851430902" name="Picture 5"/>
+            <wp:cNvGraphicFramePr>
+              <a:graphicFrameLocks xmlns:a="http://schemas.openxmlformats.org/drawingml/2006/main" noChangeAspect="1"/>
+            </wp:cNvGraphicFramePr>
+            <a:graphic xmlns:a="http://schemas.openxmlformats.org/drawingml/2006/main">
+              <a:graphicData uri="http://schemas.openxmlformats.org/drawingml/2006/picture">
+                <pic:pic xmlns:pic="http://schemas.openxmlformats.org/drawingml/2006/picture">
+                  <pic:nvPicPr>
+                    <pic:cNvPr id="0" name="Picture 1"/>
+                    <pic:cNvPicPr>
+                      <a:picLocks noChangeAspect="1" noChangeArrowheads="1"/>
+                    </pic:cNvPicPr>
+                  </pic:nvPicPr>
+                  <pic:blipFill>
+                    <a:blip r:embed="rId12" cstate="print">
+                      <a:extLst>
+                        <a:ext uri="{28A0092B-C50C-407E-A947-70E740481C1C}">
+                          <a14:useLocalDpi xmlns:a14="http://schemas.microsoft.com/office/drawing/2010/main" val="0"/>
+                        </a:ext>
+                      </a:extLst>
+                    </a:blip>
+                    <a:srcRect/>
+                    <a:stretch>
+                      <a:fillRect/>
+                    </a:stretch>
+                  </pic:blipFill>
+                  <pic:spPr bwMode="auto">
+                    <a:xfrm>
+                      <a:off x="0" y="0"/>
+                      <a:ext cx="3768394" cy="2828310"/>
+                    </a:xfrm>
+                    <a:prstGeom prst="rect">
+                      <a:avLst/>
+                    </a:prstGeom>
+                    <a:noFill/>
+                    <a:ln>
+                      <a:noFill/>
+                    </a:ln>
+                  </pic:spPr>
+                </pic:pic>
+              </a:graphicData>
+            </a:graphic>
+          </wp:inline>
+        </w:drawing>
+      </w:r>
+      <w:r>
+        <w:rPr>
+          <w:rFonts w:asciiTheme="majorHAnsi" w:hAnsiTheme="majorHAnsi" w:cstheme="majorHAnsi"/>
+          <w:noProof/>
+          <w:color w:val="4472C4" w:themeColor="accent1"/>
+          <w:sz w:val="40"/>
+          <w:szCs w:val="40"/>
+        </w:rPr>
+        <w:t xml:space="preserve">    </w:t>
+      </w:r>
+      <w:r>
+        <w:rPr>
+          <w:rFonts w:asciiTheme="majorHAnsi" w:hAnsiTheme="majorHAnsi" w:cstheme="majorHAnsi"/>
+          <w:noProof/>
+          <w:color w:val="4472C4" w:themeColor="accent1"/>
+          <w:sz w:val="40"/>
+          <w:szCs w:val="40"/>
+        </w:rPr>
+        <w:drawing>
+          <wp:inline distT="0" distB="0" distL="0" distR="0" wp14:anchorId="10E9B508" wp14:editId="67731BD4">
+            <wp:extent cx="1982993" cy="2643991"/>
+            <wp:effectExtent l="0" t="0" r="0" b="4445"/>
+            <wp:docPr id="829918543" name="Picture 7"/>
+            <wp:cNvGraphicFramePr>
+              <a:graphicFrameLocks xmlns:a="http://schemas.openxmlformats.org/drawingml/2006/main" noChangeAspect="1"/>
+            </wp:cNvGraphicFramePr>
+            <a:graphic xmlns:a="http://schemas.openxmlformats.org/drawingml/2006/main">
+              <a:graphicData uri="http://schemas.openxmlformats.org/drawingml/2006/picture">
+                <pic:pic xmlns:pic="http://schemas.openxmlformats.org/drawingml/2006/picture">
+                  <pic:nvPicPr>
+                    <pic:cNvPr id="0" name="Picture 3"/>
+                    <pic:cNvPicPr>
+                      <a:picLocks noChangeAspect="1" noChangeArrowheads="1"/>
+                    </pic:cNvPicPr>
+                  </pic:nvPicPr>
+                  <pic:blipFill>
+                    <a:blip r:embed="rId13" cstate="print">
+                      <a:extLst>
+                        <a:ext uri="{28A0092B-C50C-407E-A947-70E740481C1C}">
+                          <a14:useLocalDpi xmlns:a14="http://schemas.microsoft.com/office/drawing/2010/main" val="0"/>
+                        </a:ext>
+                      </a:extLst>
+                    </a:blip>
+                    <a:srcRect/>
+                    <a:stretch>
+                      <a:fillRect/>
+                    </a:stretch>
+                  </pic:blipFill>
+                  <pic:spPr bwMode="auto">
+                    <a:xfrm>
+                      <a:off x="0" y="0"/>
+                      <a:ext cx="1982993" cy="2643991"/>
+                    </a:xfrm>
+                    <a:prstGeom prst="rect">
+                      <a:avLst/>
+                    </a:prstGeom>
+                    <a:noFill/>
+                    <a:ln>
+                      <a:noFill/>
+                    </a:ln>
+                  </pic:spPr>
+                </pic:pic>
+              </a:graphicData>
+            </a:graphic>
+          </wp:inline>
+        </w:drawing>
+      </w:r>
+      <w:r>
+        <w:rPr>
+          <w:rFonts w:asciiTheme="majorHAnsi" w:hAnsiTheme="majorHAnsi" w:cstheme="majorHAnsi"/>
+          <w:noProof/>
+          <w:color w:val="4472C4" w:themeColor="accent1"/>
+          <w:sz w:val="40"/>
+          <w:szCs w:val="40"/>
+        </w:rPr>
+        <w:t xml:space="preserve">  </w:t>
+      </w:r>
+    </w:p>
+    <w:p>
+      <w:pPr>
+        <w:spacing w:line="240" w:lineRule="auto"/>
+        <w:rPr>
+          <w:rFonts w:asciiTheme="majorHAnsi" w:hAnsiTheme="majorHAnsi" w:cstheme="majorHAnsi"/>
+          <w:noProof/>
+          <w:color w:val="4472C4" w:themeColor="accent1"/>
+          <w:sz w:val="40"/>
+          <w:szCs w:val="40"/>
+        </w:rPr>
+      </w:pPr>
+    </w:p>
+    <w:p>
+      <w:pPr>
+        <w:spacing w:line="240" w:lineRule="auto"/>
+        <w:rPr>
+          <w:rFonts w:asciiTheme="majorHAnsi" w:hAnsiTheme="majorHAnsi" w:cstheme="majorHAnsi"/>
+          <w:i/>
+          <w:iCs/>
+          <w:sz w:val="44"/>
+          <w:szCs w:val="44"/>
+        </w:rPr>
+      </w:pPr>
+      <w:r>
+        <w:rPr>
+          <w:rFonts w:asciiTheme="majorHAnsi" w:hAnsiTheme="majorHAnsi" w:cstheme="majorHAnsi"/>
+          <w:noProof/>
+          <w:color w:val="4472C4" w:themeColor="accent1"/>
+          <w:sz w:val="40"/>
+          <w:szCs w:val="40"/>
+        </w:rPr>
+        <w:t xml:space="preserve">           </w:t>
+      </w:r>
+      <w:r>
+        <w:rPr>
+          <w:rFonts w:asciiTheme="majorHAnsi" w:hAnsiTheme="majorHAnsi" w:cstheme="majorHAnsi"/>
+          <w:b/>
+          <w:bCs/>
+          <w:i/>
+          <w:iCs/>
+          <w:color w:val="4472C4" w:themeColor="accent1"/>
+          <w:sz w:val="72"/>
+          <w:szCs w:val="72"/>
+        </w:rPr>
+        <w:t xml:space="preserve">   </w:t>
+      </w:r>
+      <w:r>
+        <w:rPr>
+          <w:rFonts w:asciiTheme="majorHAnsi" w:hAnsiTheme="majorHAnsi" w:cstheme="majorHAnsi"/>
+          <w:i/>
+          <w:iCs/>
+          <w:sz w:val="44"/>
+          <w:szCs w:val="44"/>
+        </w:rPr>
+        <w:t xml:space="preserve">             </w:t>
+      </w:r>
+    </w:p>
+    <w:p>
+      <w:pPr>
+        <w:spacing w:line="240" w:lineRule="auto"/>
+        <w:rPr>
+          <w:rFonts w:asciiTheme="majorHAnsi" w:hAnsiTheme="majorHAnsi" w:cstheme="majorHAnsi"/>
+          <w:i/>
+          <w:iCs/>
+          <w:sz w:val="44"/>
+          <w:szCs w:val="44"/>
+        </w:rPr>
+      </w:pPr>
+      <w:r>
+        <w:rPr>
+          <w:rFonts w:asciiTheme="majorHAnsi" w:hAnsiTheme="majorHAnsi" w:cstheme="majorHAnsi"/>
+          <w:noProof/>
+          <w:color w:val="4472C4" w:themeColor="accent1"/>
+          <w:sz w:val="40"/>
+          <w:szCs w:val="40"/>
+        </w:rPr>
+        <w:drawing>
+          <wp:inline distT="0" distB="0" distL="0" distR="0" wp14:anchorId="4C1FA52D" wp14:editId="58A906B4">
+            <wp:extent cx="4531828" cy="3401291"/>
+            <wp:effectExtent l="0" t="0" r="2540" b="8890"/>
+            <wp:docPr id="1622245327" name="Picture 6"/>
+            <wp:cNvGraphicFramePr>
+              <a:graphicFrameLocks xmlns:a="http://schemas.openxmlformats.org/drawingml/2006/main" noChangeAspect="1"/>
+            </wp:cNvGraphicFramePr>
+            <a:graphic xmlns:a="http://schemas.openxmlformats.org/drawingml/2006/main">
+              <a:graphicData uri="http://schemas.openxmlformats.org/drawingml/2006/picture">
+                <pic:pic xmlns:pic="http://schemas.openxmlformats.org/drawingml/2006/picture">
+                  <pic:nvPicPr>
+                    <pic:cNvPr id="0" name="Picture 2"/>
+                    <pic:cNvPicPr>
+                      <a:picLocks noChangeAspect="1" noChangeArrowheads="1"/>
+                    </pic:cNvPicPr>
+                  </pic:nvPicPr>
+                  <pic:blipFill>
+                    <a:blip r:embed="rId14" cstate="print">
+                      <a:extLst>
+                        <a:ext uri="{28A0092B-C50C-407E-A947-70E740481C1C}">
+                          <a14:useLocalDpi xmlns:a14="http://schemas.microsoft.com/office/drawing/2010/main" val="0"/>
+                        </a:ext>
+                      </a:extLst>
+                    </a:blip>
+                    <a:srcRect/>
+                    <a:stretch>
+                      <a:fillRect/>
+                    </a:stretch>
+                  </pic:blipFill>
+                  <pic:spPr bwMode="auto">
+                    <a:xfrm>
+                      <a:off x="0" y="0"/>
+                      <a:ext cx="4588106" cy="3443529"/>
+                    </a:xfrm>
+                    <a:prstGeom prst="rect">
+                      <a:avLst/>
+                    </a:prstGeom>
+                    <a:noFill/>
+                    <a:ln>
+                      <a:noFill/>
+                    </a:ln>
+                  </pic:spPr>
+                </pic:pic>
+              </a:graphicData>
+            </a:graphic>
+          </wp:inline>
+        </w:drawing>
+      </w:r>
+    </w:p>
+    <w:p>
+      <w:pPr>
+        <w:spacing w:line="240" w:lineRule="auto"/>
+        <w:rPr>
+          <w:rFonts w:asciiTheme="majorHAnsi" w:hAnsiTheme="majorHAnsi" w:cstheme="majorHAnsi"/>
+          <w:i/>
+          <w:iCs/>
+          <w:sz w:val="44"/>
+          <w:szCs w:val="44"/>
+        </w:rPr>
+      </w:pPr>
+      <w:r>
+        <w:rPr>
+          <w:rFonts w:asciiTheme="majorHAnsi" w:hAnsiTheme="majorHAnsi" w:cstheme="majorHAnsi"/>
+          <w:i/>
+          <w:iCs/>
+          <w:sz w:val="44"/>
+          <w:szCs w:val="44"/>
+        </w:rPr>
+        <w:lastRenderedPageBreak/>
+        <w:t>How it finished</w:t>
+      </w:r>
+    </w:p>
+    <w:p>
+      <w:pPr>
+        <w:spacing w:line="240" w:lineRule="auto"/>
+        <w:rPr>
+          <w:rFonts w:asciiTheme="majorHAnsi" w:hAnsiTheme="majorHAnsi" w:cstheme="majorHAnsi"/>
+          <w:i/>
+          <w:iCs/>
+          <w:sz w:val="44"/>
+          <w:szCs w:val="44"/>
+        </w:rPr>
+      </w:pPr>
+      <w:r>
+        <w:rPr>
+          <w:rFonts w:asciiTheme="majorHAnsi" w:hAnsiTheme="majorHAnsi" w:cstheme="majorHAnsi"/>
+          <w:noProof/>
+          <w:color w:val="4472C4" w:themeColor="accent1"/>
+          <w:sz w:val="40"/>
+          <w:szCs w:val="40"/>
+        </w:rPr>
+        <w:drawing>
+          <wp:inline distT="0" distB="0" distL="0" distR="0" wp14:anchorId="35E20F7E" wp14:editId="391DC474">
+            <wp:extent cx="5437909" cy="5095714"/>
+            <wp:effectExtent l="0" t="0" r="0" b="0"/>
+            <wp:docPr id="1552793715" name="Picture 8"/>
+            <wp:cNvGraphicFramePr>
+              <a:graphicFrameLocks xmlns:a="http://schemas.openxmlformats.org/drawingml/2006/main" noChangeAspect="1"/>
+            </wp:cNvGraphicFramePr>
+            <a:graphic xmlns:a="http://schemas.openxmlformats.org/drawingml/2006/main">
+              <a:graphicData uri="http://schemas.openxmlformats.org/drawingml/2006/picture">
+                <pic:pic xmlns:pic="http://schemas.openxmlformats.org/drawingml/2006/picture">
+                  <pic:nvPicPr>
+                    <pic:cNvPr id="0" name="Picture 4"/>
+                    <pic:cNvPicPr>
+                      <a:picLocks noChangeAspect="1" noChangeArrowheads="1"/>
+                    </pic:cNvPicPr>
+                  </pic:nvPicPr>
+                  <pic:blipFill>
+                    <a:blip r:embed="rId15" cstate="print">
+                      <a:extLst>
+                        <a:ext uri="{28A0092B-C50C-407E-A947-70E740481C1C}">
+                          <a14:useLocalDpi xmlns:a14="http://schemas.microsoft.com/office/drawing/2010/main" val="0"/>
+                        </a:ext>
+                      </a:extLst>
+                    </a:blip>
+                    <a:srcRect/>
+                    <a:stretch>
+                      <a:fillRect/>
+                    </a:stretch>
+                  </pic:blipFill>
+                  <pic:spPr bwMode="auto">
+                    <a:xfrm>
+                      <a:off x="0" y="0"/>
+                      <a:ext cx="5473541" cy="5129104"/>
+                    </a:xfrm>
+                    <a:prstGeom prst="rect">
+                      <a:avLst/>
+                    </a:prstGeom>
+                    <a:noFill/>
+                    <a:ln>
+                      <a:noFill/>
+                    </a:ln>
+                  </pic:spPr>
+                </pic:pic>
+              </a:graphicData>
+            </a:graphic>
+          </wp:inline>
+        </w:drawing>
+      </w:r>
+    </w:p>
+    <w:p>
+      <w:pPr>
+        <w:spacing w:line="240" w:lineRule="auto"/>
+        <w:rPr>
+          <w:rFonts w:asciiTheme="majorHAnsi" w:hAnsiTheme="majorHAnsi" w:cstheme="majorHAnsi"/>
+          <w:i/>
+          <w:iCs/>
+          <w:sz w:val="44"/>
+          <w:szCs w:val="44"/>
+        </w:rPr>
+      </w:pPr>
+      <w:r>
+        <w:rPr>
+          <w:rFonts w:asciiTheme="majorHAnsi" w:hAnsiTheme="majorHAnsi" w:cstheme="majorHAnsi"/>
+          <w:i/>
+          <w:iCs/>
+          <w:sz w:val="44"/>
+          <w:szCs w:val="44"/>
+        </w:rPr>
+        <w:t>View our project on GitHub:</w:t>
+      </w:r>
+    </w:p>
+    <w:p>
+      <w:pPr>
+        <w:spacing w:line="240" w:lineRule="auto"/>
+        <w:rPr>
+          <w:rFonts w:asciiTheme="majorHAnsi" w:hAnsiTheme="majorHAnsi" w:cstheme="majorHAnsi"/>
+          <w:sz w:val="44"/>
+          <w:szCs w:val="44"/>
+        </w:rPr>
+      </w:pPr>
+      <w:hyperlink r:id="rId16" w:history="1">
+        <w:r>
+          <w:rPr>
+            <w:rStyle w:val="Hyperlink"/>
+            <w:rFonts w:asciiTheme="majorHAnsi" w:hAnsiTheme="majorHAnsi" w:cstheme="majorHAnsi"/>
+            <w:sz w:val="44"/>
+            <w:szCs w:val="44"/>
+          </w:rPr>
+          <w:t>https://github.com/ThenulSahansa/LifeLine/</w:t>
+        </w:r>
+      </w:hyperlink>
+    </w:p>
+    <w:p>
+      <w:pPr>
+        <w:spacing w:line="240" w:lineRule="auto"/>
+        <w:rPr>
+          <w:rFonts w:asciiTheme="majorHAnsi" w:hAnsiTheme="majorHAnsi" w:cstheme="majorHAnsi"/>
+          <w:color w:val="4472C4" w:themeColor="accent1"/>
+          <w:sz w:val="40"/>
+          <w:szCs w:val="40"/>
+        </w:rPr>
+      </w:pPr>
     </w:p>
     <w:sectPr>
-      <w:footerReference w:type="default" r:id="rId10"/>
+      <w:footerReference w:type="default" r:id="rId17"/>
       <w:pgSz w:w="12240" w:h="15840"/>
       <w:pgMar w:top="1440" w:right="1440" w:bottom="1440" w:left="1440" w:header="720" w:footer="720" w:gutter="0"/>
       <w:pgNumType w:start="0"/>
@@ -5675,6 +5701,119 @@
     </w:lvl>
   </w:abstractNum>
   <w:abstractNum w:abstractNumId="3" w15:restartNumberingAfterBreak="0">
+    <w:nsid w:val="29084623"/>
+    <w:multiLevelType w:val="hybridMultilevel"/>
+    <w:tmpl w:val="ECCE4434"/>
+    <w:lvl w:ilvl="0" w:tplc="04090001">
+      <w:start w:val="1"/>
+      <w:numFmt w:val="bullet"/>
+      <w:lvlText w:val=""/>
+      <w:lvlJc w:val="left"/>
+      <w:pPr>
+        <w:ind w:left="720" w:hanging="360"/>
+      </w:pPr>
+      <w:rPr>
+        <w:rFonts w:ascii="Symbol" w:hAnsi="Symbol" w:hint="default"/>
+      </w:rPr>
+    </w:lvl>
+    <w:lvl w:ilvl="1" w:tplc="04090003" w:tentative="1">
+      <w:start w:val="1"/>
+      <w:numFmt w:val="bullet"/>
+      <w:lvlText w:val="o"/>
+      <w:lvlJc w:val="left"/>
+      <w:pPr>
+        <w:ind w:left="1440" w:hanging="360"/>
+      </w:pPr>
+      <w:rPr>
+        <w:rFonts w:ascii="Courier New" w:hAnsi="Courier New" w:cs="Courier New" w:hint="default"/>
+      </w:rPr>
+    </w:lvl>
+    <w:lvl w:ilvl="2" w:tplc="04090005" w:tentative="1">
+      <w:start w:val="1"/>
+      <w:numFmt w:val="bullet"/>
+      <w:lvlText w:val=""/>
+      <w:lvlJc w:val="left"/>
+      <w:pPr>
+        <w:ind w:left="2160" w:hanging="360"/>
+      </w:pPr>
+      <w:rPr>
+        <w:rFonts w:ascii="Wingdings" w:hAnsi="Wingdings" w:hint="default"/>
+      </w:rPr>
+    </w:lvl>
+    <w:lvl w:ilvl="3" w:tplc="04090001" w:tentative="1">
+      <w:start w:val="1"/>
+      <w:numFmt w:val="bullet"/>
+      <w:lvlText w:val=""/>
+      <w:lvlJc w:val="left"/>
+      <w:pPr>
+        <w:ind w:left="2880" w:hanging="360"/>
+      </w:pPr>
+      <w:rPr>
+        <w:rFonts w:ascii="Symbol" w:hAnsi="Symbol" w:hint="default"/>
+      </w:rPr>
+    </w:lvl>
+    <w:lvl w:ilvl="4" w:tplc="04090003" w:tentative="1">
+      <w:start w:val="1"/>
+      <w:numFmt w:val="bullet"/>
+      <w:lvlText w:val="o"/>
+      <w:lvlJc w:val="left"/>
+      <w:pPr>
+        <w:ind w:left="3600" w:hanging="360"/>
+      </w:pPr>
+      <w:rPr>
+        <w:rFonts w:ascii="Courier New" w:hAnsi="Courier New" w:cs="Courier New" w:hint="default"/>
+      </w:rPr>
+    </w:lvl>
+    <w:lvl w:ilvl="5" w:tplc="04090005" w:tentative="1">
+      <w:start w:val="1"/>
+      <w:numFmt w:val="bullet"/>
+      <w:lvlText w:val=""/>
+      <w:lvlJc w:val="left"/>
+      <w:pPr>
+        <w:ind w:left="4320" w:hanging="360"/>
+      </w:pPr>
+      <w:rPr>
+        <w:rFonts w:ascii="Wingdings" w:hAnsi="Wingdings" w:hint="default"/>
+      </w:rPr>
+    </w:lvl>
+    <w:lvl w:ilvl="6" w:tplc="04090001" w:tentative="1">
+      <w:start w:val="1"/>
+      <w:numFmt w:val="bullet"/>
+      <w:lvlText w:val=""/>
+      <w:lvlJc w:val="left"/>
+      <w:pPr>
+        <w:ind w:left="5040" w:hanging="360"/>
+      </w:pPr>
+      <w:rPr>
+        <w:rFonts w:ascii="Symbol" w:hAnsi="Symbol" w:hint="default"/>
+      </w:rPr>
+    </w:lvl>
+    <w:lvl w:ilvl="7" w:tplc="04090003" w:tentative="1">
+      <w:start w:val="1"/>
+      <w:numFmt w:val="bullet"/>
+      <w:lvlText w:val="o"/>
+      <w:lvlJc w:val="left"/>
+      <w:pPr>
+        <w:ind w:left="5760" w:hanging="360"/>
+      </w:pPr>
+      <w:rPr>
+        <w:rFonts w:ascii="Courier New" w:hAnsi="Courier New" w:cs="Courier New" w:hint="default"/>
+      </w:rPr>
+    </w:lvl>
+    <w:lvl w:ilvl="8" w:tplc="04090005" w:tentative="1">
+      <w:start w:val="1"/>
+      <w:numFmt w:val="bullet"/>
+      <w:lvlText w:val=""/>
+      <w:lvlJc w:val="left"/>
+      <w:pPr>
+        <w:ind w:left="6480" w:hanging="360"/>
+      </w:pPr>
+      <w:rPr>
+        <w:rFonts w:ascii="Wingdings" w:hAnsi="Wingdings" w:hint="default"/>
+      </w:rPr>
+    </w:lvl>
+  </w:abstractNum>
+  <w:abstractNum w:abstractNumId="4" w15:restartNumberingAfterBreak="0">
     <w:nsid w:val="32C60A7C"/>
     <w:multiLevelType w:val="hybridMultilevel"/>
     <w:tmpl w:val="BE3CA3A8"/>
@@ -5787,7 +5926,7 @@
       </w:rPr>
     </w:lvl>
   </w:abstractNum>
-  <w:abstractNum w:abstractNumId="4" w15:restartNumberingAfterBreak="0">
+  <w:abstractNum w:abstractNumId="5" w15:restartNumberingAfterBreak="0">
     <w:nsid w:val="3AFC1ACF"/>
     <w:multiLevelType w:val="hybridMultilevel"/>
     <w:tmpl w:val="6270D17C"/>
@@ -5900,7 +6039,7 @@
       </w:rPr>
     </w:lvl>
   </w:abstractNum>
-  <w:abstractNum w:abstractNumId="5" w15:restartNumberingAfterBreak="0">
+  <w:abstractNum w:abstractNumId="6" w15:restartNumberingAfterBreak="0">
     <w:nsid w:val="42E62D4A"/>
     <w:multiLevelType w:val="hybridMultilevel"/>
     <w:tmpl w:val="5A0E2B78"/>
@@ -6013,7 +6152,7 @@
       </w:rPr>
     </w:lvl>
   </w:abstractNum>
-  <w:abstractNum w:abstractNumId="6" w15:restartNumberingAfterBreak="0">
+  <w:abstractNum w:abstractNumId="7" w15:restartNumberingAfterBreak="0">
     <w:nsid w:val="509A75E2"/>
     <w:multiLevelType w:val="hybridMultilevel"/>
     <w:tmpl w:val="3BA0E60C"/>
@@ -6126,7 +6265,7 @@
       </w:rPr>
     </w:lvl>
   </w:abstractNum>
-  <w:abstractNum w:abstractNumId="7" w15:restartNumberingAfterBreak="0">
+  <w:abstractNum w:abstractNumId="8" w15:restartNumberingAfterBreak="0">
     <w:nsid w:val="54447C18"/>
     <w:multiLevelType w:val="hybridMultilevel"/>
     <w:tmpl w:val="1132F94E"/>
@@ -6239,7 +6378,7 @@
       </w:rPr>
     </w:lvl>
   </w:abstractNum>
-  <w:abstractNum w:abstractNumId="8" w15:restartNumberingAfterBreak="0">
+  <w:abstractNum w:abstractNumId="9" w15:restartNumberingAfterBreak="0">
     <w:nsid w:val="622E4FF4"/>
     <w:multiLevelType w:val="hybridMultilevel"/>
     <w:tmpl w:val="1D6878EA"/>
@@ -6352,7 +6491,7 @@
       </w:rPr>
     </w:lvl>
   </w:abstractNum>
-  <w:abstractNum w:abstractNumId="9" w15:restartNumberingAfterBreak="0">
+  <w:abstractNum w:abstractNumId="10" w15:restartNumberingAfterBreak="0">
     <w:nsid w:val="682D553F"/>
     <w:multiLevelType w:val="hybridMultilevel"/>
     <w:tmpl w:val="499EC592"/>
@@ -6438,7 +6577,7 @@
       </w:pPr>
     </w:lvl>
   </w:abstractNum>
-  <w:abstractNum w:abstractNumId="10" w15:restartNumberingAfterBreak="0">
+  <w:abstractNum w:abstractNumId="11" w15:restartNumberingAfterBreak="0">
     <w:nsid w:val="70412E19"/>
     <w:multiLevelType w:val="hybridMultilevel"/>
     <w:tmpl w:val="8A2C5122"/>
@@ -6551,7 +6690,7 @@
       </w:rPr>
     </w:lvl>
   </w:abstractNum>
-  <w:abstractNum w:abstractNumId="11" w15:restartNumberingAfterBreak="0">
+  <w:abstractNum w:abstractNumId="12" w15:restartNumberingAfterBreak="0">
     <w:nsid w:val="7B6766B1"/>
     <w:multiLevelType w:val="hybridMultilevel"/>
     <w:tmpl w:val="DB5C083A"/>
@@ -6665,25 +6804,25 @@
     </w:lvl>
   </w:abstractNum>
   <w:num w:numId="1" w16cid:durableId="947541019">
-    <w:abstractNumId w:val="9"/>
+    <w:abstractNumId w:val="10"/>
   </w:num>
   <w:num w:numId="2" w16cid:durableId="322003528">
+    <w:abstractNumId w:val="5"/>
+  </w:num>
+  <w:num w:numId="3" w16cid:durableId="305816506">
     <w:abstractNumId w:val="4"/>
   </w:num>
-  <w:num w:numId="3" w16cid:durableId="305816506">
-    <w:abstractNumId w:val="3"/>
-  </w:num>
   <w:num w:numId="4" w16cid:durableId="62796791">
-    <w:abstractNumId w:val="7"/>
+    <w:abstractNumId w:val="8"/>
   </w:num>
   <w:num w:numId="5" w16cid:durableId="747726189">
-    <w:abstractNumId w:val="6"/>
+    <w:abstractNumId w:val="7"/>
   </w:num>
   <w:num w:numId="6" w16cid:durableId="40397787">
     <w:abstractNumId w:val="1"/>
   </w:num>
   <w:num w:numId="7" w16cid:durableId="1678655731">
-    <w:abstractNumId w:val="11"/>
+    <w:abstractNumId w:val="12"/>
   </w:num>
   <w:num w:numId="8" w16cid:durableId="2018530439">
     <w:abstractNumId w:val="2"/>
@@ -6692,13 +6831,16 @@
     <w:abstractNumId w:val="0"/>
   </w:num>
   <w:num w:numId="10" w16cid:durableId="541022021">
-    <w:abstractNumId w:val="5"/>
+    <w:abstractNumId w:val="6"/>
   </w:num>
   <w:num w:numId="11" w16cid:durableId="1697344445">
-    <w:abstractNumId w:val="10"/>
+    <w:abstractNumId w:val="11"/>
   </w:num>
   <w:num w:numId="12" w16cid:durableId="1570647979">
-    <w:abstractNumId w:val="8"/>
+    <w:abstractNumId w:val="9"/>
+  </w:num>
+  <w:num w:numId="13" w16cid:durableId="1865241419">
+    <w:abstractNumId w:val="3"/>
   </w:num>
 </w:numbering>
 </file>
@@ -7101,7 +7243,7 @@
   <w:style w:type="paragraph" w:default="1" w:styleId="Normal">
     <w:name w:val="Normal"/>
     <w:qFormat/>
-    <w:rsid w:val="003B2F93"/>
+    <w:rsid w:val="001A38A2"/>
   </w:style>
   <w:style w:type="paragraph" w:styleId="Heading1">
     <w:name w:val="heading 1"/>

</xml_diff>